<commit_message>
Update final report: title, mentor and Dean details, repo link, target-zone analysis
Co-Authored-By: Claude Opus 5.5 <noreply@anthropic.com>
</commit_message>
<xml_diff>
--- a/report/ForgetBench_Project_Report.docx
+++ b/report/ForgetBench_Project_Report.docx
@@ -123,7 +123,7 @@
           <w:sz w:val="32"/>
           <w:szCs w:val="32"/>
         </w:rPr>
-        <w:t xml:space="preserve">FORGETBENCH: EVALUATING THE DURABILITY OF MACHINE UNLEARNING IN LANGUAGE MODELS WITH HYBRID RETENTION-AWARE UNLEARNING (HRU)</w:t>
+        <w:t xml:space="preserve">FORGETBENCH</w:t>
       </w:r>
     </w:p>
     <w:p>
@@ -256,10 +256,7 @@
         <w:jc w:val="center"/>
       </w:pPr>
       <w:r>
-        <w:rPr>
-          <w:highlight w:val="yellow"/>
-        </w:rPr>
-        <w:t xml:space="preserve">[Designation]</w:t>
+        <w:t xml:space="preserve">Professor</w:t>
       </w:r>
     </w:p>
     <w:p>
@@ -300,7 +297,7 @@
         <w:jc w:val="both"/>
       </w:pPr>
       <w:r>
-        <w:t xml:space="preserve">This is to certify that the project report entitled "ForgetBench: Evaluating the Durability of Machine Unlearning in Language Models with Hybrid Retention-aware Unlearning (HRU)" submitted by </w:t>
+        <w:t xml:space="preserve">This is to certify that the project report entitled "ForgetBench" submitted by </w:t>
       </w:r>
       <w:r>
         <w:t xml:space="preserve">Bulla Joel Arpith (25WU0103011), Kanchusthambham Jayanth (25WU0103021), Macha Sai Kamal (25WU0103026), Shaik Shahul Parvez (25WU0103036), Damera Sai Sri Ranga Charan (25WU0102048)</w:t>
@@ -342,13 +339,7 @@
         <w:jc w:val="left"/>
       </w:pPr>
       <w:r>
-        <w:t xml:space="preserve">Designation: </w:t>
-      </w:r>
-      <w:r>
-        <w:rPr>
-          <w:highlight w:val="yellow"/>
-        </w:rPr>
-        <w:t xml:space="preserve">[Designation]</w:t>
+        <w:t xml:space="preserve">Designation: Professor</w:t>
       </w:r>
     </w:p>
     <w:p>
@@ -357,13 +348,7 @@
         <w:jc w:val="left"/>
       </w:pPr>
       <w:r>
-        <w:t xml:space="preserve">Date: </w:t>
-      </w:r>
-      <w:r>
-        <w:rPr>
-          <w:highlight w:val="yellow"/>
-        </w:rPr>
-        <w:t xml:space="preserve">[DD/MM/YYYY]</w:t>
+        <w:t xml:space="preserve">Date: 08/10/26</w:t>
       </w:r>
     </w:p>
     <w:p>
@@ -388,7 +373,7 @@
         <w:jc w:val="both"/>
       </w:pPr>
       <w:r>
-        <w:t xml:space="preserve">We hereby declare that the project work entitled "ForgetBench: Evaluating the Durability of Machine Unlearning in Language Models with Hybrid Retention-aware Unlearning (HRU)" submitted to the School of Technology, Woxsen University, in partial fulfillment of the requirements of the course Conceptual Project – I towards the degree of Bachelor of Technology (B.Tech.) is our original work and has been carried out under the guidance of Prof. Geetha Tripathi.</w:t>
+        <w:t xml:space="preserve">We hereby declare that the project work entitled "ForgetBench" submitted to the School of Technology, Woxsen University, in partial fulfillment of the requirements of the course Conceptual Project – I towards the degree of Bachelor of Technology (B.Tech.) is our original work and has been carried out under the guidance of Prof. Geetha Tripathi.</w:t>
       </w:r>
     </w:p>
     <w:p>
@@ -496,13 +481,7 @@
         <w:jc w:val="left"/>
       </w:pPr>
       <w:r>
-        <w:t xml:space="preserve">Date: </w:t>
-      </w:r>
-      <w:r>
-        <w:rPr>
-          <w:highlight w:val="yellow"/>
-        </w:rPr>
-        <w:t xml:space="preserve">[DD/MM/YYYY]</w:t>
+        <w:t xml:space="preserve">Date: 08/10/26</w:t>
       </w:r>
     </w:p>
     <w:p>
@@ -536,16 +515,7 @@
         <w:jc w:val="both"/>
       </w:pPr>
       <w:r>
-        <w:t xml:space="preserve">First and foremost, we thank our project mentor, Prof. Geetha Tripathi, </w:t>
-      </w:r>
-      <w:r>
-        <w:rPr>
-          <w:highlight w:val="yellow"/>
-        </w:rPr>
-        <w:t xml:space="preserve">[Designation]</w:t>
-      </w:r>
-      <w:r>
-        <w:t xml:space="preserve">, for her guidance, continuous support and constructive feedback throughout the project. Her questions about what our results could and could not prove shaped the evaluation design and the self-audit reported in Chapter 4.</w:t>
+        <w:t xml:space="preserve">First and foremost, we thank our project mentor, Prof. Geetha Tripathi, Professor, for her guidance, continuous support and constructive feedback throughout the project. Her questions about what our results could and could not prove shaped the evaluation design and the self-audit reported in Chapter 4.</w:t>
       </w:r>
     </w:p>
     <w:p>
@@ -554,25 +524,7 @@
         <w:jc w:val="both"/>
       </w:pPr>
       <w:r>
-        <w:t xml:space="preserve">We are grateful to </w:t>
-      </w:r>
-      <w:r>
-        <w:rPr>
-          <w:highlight w:val="yellow"/>
-        </w:rPr>
-        <w:t xml:space="preserve">[Name of the Head of Department]</w:t>
-      </w:r>
-      <w:r>
-        <w:t xml:space="preserve">, Head of the </w:t>
-      </w:r>
-      <w:r>
-        <w:rPr>
-          <w:highlight w:val="yellow"/>
-        </w:rPr>
-        <w:t xml:space="preserve">[Department name]</w:t>
-      </w:r>
-      <w:r>
-        <w:t xml:space="preserve">, School of Technology, for providing the facilities and resources required for this work.</w:t>
+        <w:t xml:space="preserve">We are grateful to Dr. Kiran Mayee, Dean, School of Technology, for providing the facilities and resources required for this work.</w:t>
       </w:r>
     </w:p>
     <w:p>
@@ -642,7 +594,7 @@
         <w:jc w:val="both"/>
       </w:pPr>
       <w:r>
-        <w:t xml:space="preserve">Unsharded HRU recorded the lowest post-attack forget-set log-probability of all twelve variants (-1.309, against -0.582 for full retraining and -0.762 for NPO) while avoiding NPO's over-forgetting (truth ratio 1.29 versus 13.17). We also found that SISA-style sharding dilutes approximate unlearning: a scrubbed shard scoring -4.179 alone reads -0.502 inside a four-shard ensemble, because logit averaging lets untouched shards outvote the scrubbed one. A self-audit showed that the durability metric correlates with overall model damage (r = +0.88); after adjusting for damage, HRU remains the second most durable method, behind full retraining. A fact-level metric and an equal-budget, three-seed validation of HRU's per-example re-weighting step have been implemented as the next phase.</w:t>
+        <w:t xml:space="preserve">Unsharded HRU recorded the lowest post-attack forget-set log-probability of all twelve variants (-1.309, against -0.582 for full retraining and -0.762 for NPO) while avoiding NPO's over-forgetting (truth ratio 1.29 versus 13.17). Plotted on cost and durability together, it is the most durable method inside the project's target zone: more durable than full retraining at 80% of its cost. We also found that SISA-style sharding dilutes approximate unlearning: a scrubbed shard scoring -4.179 alone reads -0.502 inside a four-shard ensemble, because logit averaging lets untouched shards outvote the scrubbed one. A self-audit showed that the durability metric correlates with overall model damage (r = +0.88); after adjusting for damage, HRU remains the second most durable method, behind full retraining. A fact-level metric and an equal-budget, three-seed validation of HRU's per-example re-weighting step have been implemented as the next phase.</w:t>
       </w:r>
     </w:p>
     <w:p>
@@ -808,7 +760,7 @@
         <w:jc w:val="left"/>
       </w:pPr>
       <w:r>
-        <w:t xml:space="preserve">Table A.1: Deployment Tool Profiles</w:t>
+        <w:t xml:space="preserve">Table A.1: GitHub Profiles</w:t>
       </w:r>
     </w:p>
     <w:p>
@@ -879,6 +831,15 @@
       </w:pPr>
       <w:r>
         <w:t xml:space="preserve">Figure 4.3: Durability Versus Model Damage</w:t>
+      </w:r>
+    </w:p>
+    <w:p>
+      <w:pPr>
+        <w:spacing w:after="60" w:before="0" w:line="360"/>
+        <w:jc w:val="left"/>
+      </w:pPr>
+      <w:r>
+        <w:t xml:space="preserve">Figure 4.4: Cost-Durability Target Zone</w:t>
       </w:r>
     </w:p>
     <w:p>
@@ -5173,10 +5134,7 @@
         <w:t xml:space="preserve">The harness is implemented in Python with PyTorch and Hugging Face Transformers and runs on Google Colab with a single NVIDIA T4 GPU. It is organised as seven Jupyter notebooks that share a utilities module and save all data, checkpoints and results to Google Drive, so that each stage can be re-run independently (Appendix II). The code is version-controlled at </w:t>
       </w:r>
       <w:r>
-        <w:rPr>
-          <w:highlight w:val="yellow"/>
-        </w:rPr>
-        <w:t xml:space="preserve">[GitHub repository URL]</w:t>
+        <w:t xml:space="preserve">https://github.com/Joel-Arpith/ForgetBench</w:t>
       </w:r>
       <w:r>
         <w:t xml:space="preserve">.</w:t>
@@ -8837,6 +8795,86 @@
     </w:p>
     <w:p>
       <w:pPr>
+        <w:spacing w:after="120" w:before="0" w:line="360"/>
+        <w:jc w:val="both"/>
+      </w:pPr>
+      <w:r>
+        <w:t xml:space="preserve">Figure 4.4 places every method on cost and durability together. The shaded target zone marks the region the project aims for: durability between -0.60 and -1.56, that is, at least as durable as full retraining (-0.582), at a cost below full retraining (150 updates). Unsharded HRU lies inside the zone and is the most durable method in it, at -1.309 with 120 updates, 80% of the cost of retraining.</w:t>
+      </w:r>
+    </w:p>
+    <w:p>
+      <w:pPr>
+        <w:keepNext/>
+        <w:spacing w:before="120"/>
+        <w:jc w:val="center"/>
+      </w:pPr>
+      <w:r>
+        <w:drawing>
+          <wp:inline distT="0" distB="0" distL="0" distR="0">
+            <wp:extent cx="5334000" cy="3448050"/>
+            <wp:effectExtent t="0" r="0" b="0" l="0"/>
+            <wp:docPr id="7" name="" descr="" title=""/>
+            <wp:cNvGraphicFramePr>
+              <a:graphicFrameLocks xmlns:a="http://schemas.openxmlformats.org/drawingml/2006/main" noChangeAspect="1"/>
+            </wp:cNvGraphicFramePr>
+            <a:graphic xmlns:a="http://schemas.openxmlformats.org/drawingml/2006/main">
+              <a:graphicData uri="http://schemas.openxmlformats.org/drawingml/2006/picture">
+                <pic:pic xmlns:pic="http://schemas.openxmlformats.org/drawingml/2006/picture">
+                  <pic:nvPicPr>
+                    <pic:cNvPr id="0" name="" descr=""/>
+                    <pic:cNvPicPr>
+                      <a:picLocks noChangeAspect="1" noChangeArrowheads="1"/>
+                    </pic:cNvPicPr>
+                  </pic:nvPicPr>
+                  <pic:blipFill>
+                    <a:blip r:embed="rId15" cstate="none"/>
+                    <a:srcRect/>
+                    <a:stretch>
+                      <a:fillRect/>
+                    </a:stretch>
+                  </pic:blipFill>
+                  <pic:spPr bwMode="auto">
+                    <a:xfrm>
+                      <a:off x="0" y="0"/>
+                      <a:ext cx="5334000" cy="3448050"/>
+                    </a:xfrm>
+                    <a:prstGeom prst="rect">
+                      <a:avLst/>
+                    </a:prstGeom>
+                  </pic:spPr>
+                </pic:pic>
+              </a:graphicData>
+            </a:graphic>
+          </wp:inline>
+        </w:drawing>
+      </w:r>
+    </w:p>
+    <w:p>
+      <w:pPr>
+        <w:spacing w:after="240" w:before="80"/>
+        <w:jc w:val="center"/>
+      </w:pPr>
+      <w:r>
+        <w:rPr>
+          <w:i/>
+          <w:iCs/>
+          <w:sz w:val="22"/>
+          <w:szCs w:val="22"/>
+        </w:rPr>
+        <w:t xml:space="preserve">Figure 4.4: Cost-Durability Target Zone</w:t>
+      </w:r>
+    </w:p>
+    <w:p>
+      <w:pPr>
+        <w:spacing w:after="120" w:before="0" w:line="360"/>
+        <w:jc w:val="both"/>
+      </w:pPr>
+      <w:r>
+        <w:t xml:space="preserve">Gradient ascent and NPO also enter the zone, at one third of HRU's cost, but with truth ratios of 1.67 and 13.17: they reach it by over-forgetting, so that the model prefers wrong answers, whereas HRU's truth ratio of 1.29 stays close to the 1.01 of a retrained model. Sharded HRU, SISA and RMU fall below the zone. HRU's position comes with the retain-set cost discussed in Section 4.3, and its multi-seed confirmation is the purpose of the validation phase (Section 5.3).</w:t>
+      </w:r>
+    </w:p>
+    <w:p>
+      <w:pPr>
         <w:pStyle w:val="Heading2"/>
         <w:keepNext/>
       </w:pPr>
@@ -10375,6 +10413,15 @@
         <w:t xml:space="preserve">I.2 Deployment Tools</w:t>
       </w:r>
     </w:p>
+    <w:p>
+      <w:pPr>
+        <w:spacing w:after="120" w:before="0" w:line="360"/>
+        <w:jc w:val="both"/>
+      </w:pPr>
+      <w:r>
+        <w:t xml:space="preserve">All project code, notebooks, documentation and reports are maintained in the team repository https://github.com/Joel-Arpith/ForgetBench. Each member contributes through their own branch and pull request, reviewed by another member before it is merged into the protected main branch.</w:t>
+      </w:r>
+    </w:p>
     <w:tbl>
       <w:tblPr>
         <w:tblW w:type="dxa" w:w="9360"/>
@@ -10390,10 +10437,8 @@
         <w:tblLayout w:type="fixed"/>
       </w:tblPr>
       <w:tblGrid>
-        <w:gridCol w:w="3060"/>
-        <w:gridCol w:w="2100"/>
-        <w:gridCol w:w="2100"/>
-        <w:gridCol w:w="2100"/>
+        <w:gridCol w:w="3660"/>
+        <w:gridCol w:w="5700"/>
       </w:tblGrid>
       <w:tr>
         <w:trPr>
@@ -10401,7 +10446,7 @@
         </w:trPr>
         <w:tc>
           <w:tcPr>
-            <w:tcW w:type="dxa" w:w="3060"/>
+            <w:tcW w:type="dxa" w:w="3660"/>
             <w:tcBorders>
               <w:top w:val="single" w:color="808080" w:sz="4"/>
               <w:left w:val="single" w:color="808080" w:sz="4"/>
@@ -10432,7 +10477,7 @@
         </w:tc>
         <w:tc>
           <w:tcPr>
-            <w:tcW w:type="dxa" w:w="2100"/>
+            <w:tcW w:type="dxa" w:w="5700"/>
             <w:tcBorders>
               <w:top w:val="single" w:color="808080" w:sz="4"/>
               <w:left w:val="single" w:color="808080" w:sz="4"/>
@@ -10457,69 +10502,7 @@
                 <w:b/>
                 <w:bCs/>
               </w:rPr>
-              <w:t xml:space="preserve">GitHub</w:t>
-            </w:r>
-          </w:p>
-        </w:tc>
-        <w:tc>
-          <w:tcPr>
-            <w:tcW w:type="dxa" w:w="2100"/>
-            <w:tcBorders>
-              <w:top w:val="single" w:color="808080" w:sz="4"/>
-              <w:left w:val="single" w:color="808080" w:sz="4"/>
-              <w:bottom w:val="single" w:color="808080" w:sz="4"/>
-              <w:right w:val="single" w:color="808080" w:sz="4"/>
-            </w:tcBorders>
-            <w:shd w:fill="D5E8F0" w:color="auto" w:val="clear"/>
-            <w:tcMar>
-              <w:top w:type="dxa" w:w="120"/>
-              <w:left w:type="dxa" w:w="160"/>
-              <w:bottom w:type="dxa" w:w="120"/>
-              <w:right w:type="dxa" w:w="160"/>
-            </w:tcMar>
-          </w:tcPr>
-          <w:p>
-            <w:pPr>
-              <w:spacing w:after="0" w:line="260"/>
-              <w:jc w:val="left"/>
-            </w:pPr>
-            <w:r>
-              <w:rPr>
-                <w:b/>
-                <w:bCs/>
-              </w:rPr>
-              <w:t xml:space="preserve">HackerRank</w:t>
-            </w:r>
-          </w:p>
-        </w:tc>
-        <w:tc>
-          <w:tcPr>
-            <w:tcW w:type="dxa" w:w="2100"/>
-            <w:tcBorders>
-              <w:top w:val="single" w:color="808080" w:sz="4"/>
-              <w:left w:val="single" w:color="808080" w:sz="4"/>
-              <w:bottom w:val="single" w:color="808080" w:sz="4"/>
-              <w:right w:val="single" w:color="808080" w:sz="4"/>
-            </w:tcBorders>
-            <w:shd w:fill="D5E8F0" w:color="auto" w:val="clear"/>
-            <w:tcMar>
-              <w:top w:type="dxa" w:w="120"/>
-              <w:left w:type="dxa" w:w="160"/>
-              <w:bottom w:type="dxa" w:w="120"/>
-              <w:right w:type="dxa" w:w="160"/>
-            </w:tcMar>
-          </w:tcPr>
-          <w:p>
-            <w:pPr>
-              <w:spacing w:after="0" w:line="260"/>
-              <w:jc w:val="left"/>
-            </w:pPr>
-            <w:r>
-              <w:rPr>
-                <w:b/>
-                <w:bCs/>
-              </w:rPr>
-              <w:t xml:space="preserve">LeetCode</w:t>
+              <w:t xml:space="preserve">GitHub profile</w:t>
             </w:r>
           </w:p>
         </w:tc>
@@ -10527,7 +10510,7 @@
       <w:tr>
         <w:tc>
           <w:tcPr>
-            <w:tcW w:type="dxa" w:w="3060"/>
+            <w:tcW w:type="dxa" w:w="3660"/>
             <w:tcBorders>
               <w:top w:val="single" w:color="808080" w:sz="4"/>
               <w:left w:val="single" w:color="808080" w:sz="4"/>
@@ -10553,88 +10536,27 @@
         </w:tc>
         <w:tc>
           <w:tcPr>
-            <w:tcW w:type="dxa" w:w="2100"/>
-            <w:tcBorders>
-              <w:top w:val="single" w:color="808080" w:sz="4"/>
-              <w:left w:val="single" w:color="808080" w:sz="4"/>
-              <w:bottom w:val="single" w:color="808080" w:sz="4"/>
-              <w:right w:val="single" w:color="808080" w:sz="4"/>
-            </w:tcBorders>
-            <w:tcMar>
-              <w:top w:type="dxa" w:w="120"/>
-              <w:left w:type="dxa" w:w="160"/>
-              <w:bottom w:type="dxa" w:w="120"/>
-              <w:right w:type="dxa" w:w="160"/>
-            </w:tcMar>
-          </w:tcPr>
-          <w:p>
-            <w:pPr>
-              <w:spacing w:after="0" w:line="260"/>
-              <w:jc w:val="left"/>
-            </w:pPr>
-            <w:r>
-              <w:rPr>
-                <w:highlight w:val="yellow"/>
-              </w:rPr>
-              <w:t xml:space="preserve">[link]</w:t>
-            </w:r>
-          </w:p>
-        </w:tc>
-        <w:tc>
-          <w:tcPr>
-            <w:tcW w:type="dxa" w:w="2100"/>
-            <w:tcBorders>
-              <w:top w:val="single" w:color="808080" w:sz="4"/>
-              <w:left w:val="single" w:color="808080" w:sz="4"/>
-              <w:bottom w:val="single" w:color="808080" w:sz="4"/>
-              <w:right w:val="single" w:color="808080" w:sz="4"/>
-            </w:tcBorders>
-            <w:tcMar>
-              <w:top w:type="dxa" w:w="120"/>
-              <w:left w:type="dxa" w:w="160"/>
-              <w:bottom w:type="dxa" w:w="120"/>
-              <w:right w:type="dxa" w:w="160"/>
-            </w:tcMar>
-          </w:tcPr>
-          <w:p>
-            <w:pPr>
-              <w:spacing w:after="0" w:line="260"/>
-              <w:jc w:val="left"/>
-            </w:pPr>
-            <w:r>
-              <w:rPr>
-                <w:highlight w:val="yellow"/>
-              </w:rPr>
-              <w:t xml:space="preserve">[link]</w:t>
-            </w:r>
-          </w:p>
-        </w:tc>
-        <w:tc>
-          <w:tcPr>
-            <w:tcW w:type="dxa" w:w="2100"/>
-            <w:tcBorders>
-              <w:top w:val="single" w:color="808080" w:sz="4"/>
-              <w:left w:val="single" w:color="808080" w:sz="4"/>
-              <w:bottom w:val="single" w:color="808080" w:sz="4"/>
-              <w:right w:val="single" w:color="808080" w:sz="4"/>
-            </w:tcBorders>
-            <w:tcMar>
-              <w:top w:type="dxa" w:w="120"/>
-              <w:left w:type="dxa" w:w="160"/>
-              <w:bottom w:type="dxa" w:w="120"/>
-              <w:right w:type="dxa" w:w="160"/>
-            </w:tcMar>
-          </w:tcPr>
-          <w:p>
-            <w:pPr>
-              <w:spacing w:after="0" w:line="260"/>
-              <w:jc w:val="left"/>
-            </w:pPr>
-            <w:r>
-              <w:rPr>
-                <w:highlight w:val="yellow"/>
-              </w:rPr>
-              <w:t xml:space="preserve">[link]</w:t>
+            <w:tcW w:type="dxa" w:w="5700"/>
+            <w:tcBorders>
+              <w:top w:val="single" w:color="808080" w:sz="4"/>
+              <w:left w:val="single" w:color="808080" w:sz="4"/>
+              <w:bottom w:val="single" w:color="808080" w:sz="4"/>
+              <w:right w:val="single" w:color="808080" w:sz="4"/>
+            </w:tcBorders>
+            <w:tcMar>
+              <w:top w:type="dxa" w:w="120"/>
+              <w:left w:type="dxa" w:w="160"/>
+              <w:bottom w:type="dxa" w:w="120"/>
+              <w:right w:type="dxa" w:w="160"/>
+            </w:tcMar>
+          </w:tcPr>
+          <w:p>
+            <w:pPr>
+              <w:spacing w:after="0" w:line="260"/>
+              <w:jc w:val="left"/>
+            </w:pPr>
+            <w:r>
+              <w:t xml:space="preserve">https://github.com/Joel-Arpith</w:t>
             </w:r>
           </w:p>
         </w:tc>
@@ -10642,7 +10564,7 @@
       <w:tr>
         <w:tc>
           <w:tcPr>
-            <w:tcW w:type="dxa" w:w="3060"/>
+            <w:tcW w:type="dxa" w:w="3660"/>
             <w:tcBorders>
               <w:top w:val="single" w:color="808080" w:sz="4"/>
               <w:left w:val="single" w:color="808080" w:sz="4"/>
@@ -10668,88 +10590,27 @@
         </w:tc>
         <w:tc>
           <w:tcPr>
-            <w:tcW w:type="dxa" w:w="2100"/>
-            <w:tcBorders>
-              <w:top w:val="single" w:color="808080" w:sz="4"/>
-              <w:left w:val="single" w:color="808080" w:sz="4"/>
-              <w:bottom w:val="single" w:color="808080" w:sz="4"/>
-              <w:right w:val="single" w:color="808080" w:sz="4"/>
-            </w:tcBorders>
-            <w:tcMar>
-              <w:top w:type="dxa" w:w="120"/>
-              <w:left w:type="dxa" w:w="160"/>
-              <w:bottom w:type="dxa" w:w="120"/>
-              <w:right w:type="dxa" w:w="160"/>
-            </w:tcMar>
-          </w:tcPr>
-          <w:p>
-            <w:pPr>
-              <w:spacing w:after="0" w:line="260"/>
-              <w:jc w:val="left"/>
-            </w:pPr>
-            <w:r>
-              <w:rPr>
-                <w:highlight w:val="yellow"/>
-              </w:rPr>
-              <w:t xml:space="preserve">[link]</w:t>
-            </w:r>
-          </w:p>
-        </w:tc>
-        <w:tc>
-          <w:tcPr>
-            <w:tcW w:type="dxa" w:w="2100"/>
-            <w:tcBorders>
-              <w:top w:val="single" w:color="808080" w:sz="4"/>
-              <w:left w:val="single" w:color="808080" w:sz="4"/>
-              <w:bottom w:val="single" w:color="808080" w:sz="4"/>
-              <w:right w:val="single" w:color="808080" w:sz="4"/>
-            </w:tcBorders>
-            <w:tcMar>
-              <w:top w:type="dxa" w:w="120"/>
-              <w:left w:type="dxa" w:w="160"/>
-              <w:bottom w:type="dxa" w:w="120"/>
-              <w:right w:type="dxa" w:w="160"/>
-            </w:tcMar>
-          </w:tcPr>
-          <w:p>
-            <w:pPr>
-              <w:spacing w:after="0" w:line="260"/>
-              <w:jc w:val="left"/>
-            </w:pPr>
-            <w:r>
-              <w:rPr>
-                <w:highlight w:val="yellow"/>
-              </w:rPr>
-              <w:t xml:space="preserve">[link]</w:t>
-            </w:r>
-          </w:p>
-        </w:tc>
-        <w:tc>
-          <w:tcPr>
-            <w:tcW w:type="dxa" w:w="2100"/>
-            <w:tcBorders>
-              <w:top w:val="single" w:color="808080" w:sz="4"/>
-              <w:left w:val="single" w:color="808080" w:sz="4"/>
-              <w:bottom w:val="single" w:color="808080" w:sz="4"/>
-              <w:right w:val="single" w:color="808080" w:sz="4"/>
-            </w:tcBorders>
-            <w:tcMar>
-              <w:top w:type="dxa" w:w="120"/>
-              <w:left w:type="dxa" w:w="160"/>
-              <w:bottom w:type="dxa" w:w="120"/>
-              <w:right w:type="dxa" w:w="160"/>
-            </w:tcMar>
-          </w:tcPr>
-          <w:p>
-            <w:pPr>
-              <w:spacing w:after="0" w:line="260"/>
-              <w:jc w:val="left"/>
-            </w:pPr>
-            <w:r>
-              <w:rPr>
-                <w:highlight w:val="yellow"/>
-              </w:rPr>
-              <w:t xml:space="preserve">[link]</w:t>
+            <w:tcW w:type="dxa" w:w="5700"/>
+            <w:tcBorders>
+              <w:top w:val="single" w:color="808080" w:sz="4"/>
+              <w:left w:val="single" w:color="808080" w:sz="4"/>
+              <w:bottom w:val="single" w:color="808080" w:sz="4"/>
+              <w:right w:val="single" w:color="808080" w:sz="4"/>
+            </w:tcBorders>
+            <w:tcMar>
+              <w:top w:type="dxa" w:w="120"/>
+              <w:left w:type="dxa" w:w="160"/>
+              <w:bottom w:type="dxa" w:w="120"/>
+              <w:right w:type="dxa" w:w="160"/>
+            </w:tcMar>
+          </w:tcPr>
+          <w:p>
+            <w:pPr>
+              <w:spacing w:after="0" w:line="260"/>
+              <w:jc w:val="left"/>
+            </w:pPr>
+            <w:r>
+              <w:t xml:space="preserve">https://github.com/kvenkatjayanth89-dotcom</w:t>
             </w:r>
           </w:p>
         </w:tc>
@@ -10757,7 +10618,7 @@
       <w:tr>
         <w:tc>
           <w:tcPr>
-            <w:tcW w:type="dxa" w:w="3060"/>
+            <w:tcW w:type="dxa" w:w="3660"/>
             <w:tcBorders>
               <w:top w:val="single" w:color="808080" w:sz="4"/>
               <w:left w:val="single" w:color="808080" w:sz="4"/>
@@ -10783,88 +10644,27 @@
         </w:tc>
         <w:tc>
           <w:tcPr>
-            <w:tcW w:type="dxa" w:w="2100"/>
-            <w:tcBorders>
-              <w:top w:val="single" w:color="808080" w:sz="4"/>
-              <w:left w:val="single" w:color="808080" w:sz="4"/>
-              <w:bottom w:val="single" w:color="808080" w:sz="4"/>
-              <w:right w:val="single" w:color="808080" w:sz="4"/>
-            </w:tcBorders>
-            <w:tcMar>
-              <w:top w:type="dxa" w:w="120"/>
-              <w:left w:type="dxa" w:w="160"/>
-              <w:bottom w:type="dxa" w:w="120"/>
-              <w:right w:type="dxa" w:w="160"/>
-            </w:tcMar>
-          </w:tcPr>
-          <w:p>
-            <w:pPr>
-              <w:spacing w:after="0" w:line="260"/>
-              <w:jc w:val="left"/>
-            </w:pPr>
-            <w:r>
-              <w:rPr>
-                <w:highlight w:val="yellow"/>
-              </w:rPr>
-              <w:t xml:space="preserve">[link]</w:t>
-            </w:r>
-          </w:p>
-        </w:tc>
-        <w:tc>
-          <w:tcPr>
-            <w:tcW w:type="dxa" w:w="2100"/>
-            <w:tcBorders>
-              <w:top w:val="single" w:color="808080" w:sz="4"/>
-              <w:left w:val="single" w:color="808080" w:sz="4"/>
-              <w:bottom w:val="single" w:color="808080" w:sz="4"/>
-              <w:right w:val="single" w:color="808080" w:sz="4"/>
-            </w:tcBorders>
-            <w:tcMar>
-              <w:top w:type="dxa" w:w="120"/>
-              <w:left w:type="dxa" w:w="160"/>
-              <w:bottom w:type="dxa" w:w="120"/>
-              <w:right w:type="dxa" w:w="160"/>
-            </w:tcMar>
-          </w:tcPr>
-          <w:p>
-            <w:pPr>
-              <w:spacing w:after="0" w:line="260"/>
-              <w:jc w:val="left"/>
-            </w:pPr>
-            <w:r>
-              <w:rPr>
-                <w:highlight w:val="yellow"/>
-              </w:rPr>
-              <w:t xml:space="preserve">[link]</w:t>
-            </w:r>
-          </w:p>
-        </w:tc>
-        <w:tc>
-          <w:tcPr>
-            <w:tcW w:type="dxa" w:w="2100"/>
-            <w:tcBorders>
-              <w:top w:val="single" w:color="808080" w:sz="4"/>
-              <w:left w:val="single" w:color="808080" w:sz="4"/>
-              <w:bottom w:val="single" w:color="808080" w:sz="4"/>
-              <w:right w:val="single" w:color="808080" w:sz="4"/>
-            </w:tcBorders>
-            <w:tcMar>
-              <w:top w:type="dxa" w:w="120"/>
-              <w:left w:type="dxa" w:w="160"/>
-              <w:bottom w:type="dxa" w:w="120"/>
-              <w:right w:type="dxa" w:w="160"/>
-            </w:tcMar>
-          </w:tcPr>
-          <w:p>
-            <w:pPr>
-              <w:spacing w:after="0" w:line="260"/>
-              <w:jc w:val="left"/>
-            </w:pPr>
-            <w:r>
-              <w:rPr>
-                <w:highlight w:val="yellow"/>
-              </w:rPr>
-              <w:t xml:space="preserve">[link]</w:t>
+            <w:tcW w:type="dxa" w:w="5700"/>
+            <w:tcBorders>
+              <w:top w:val="single" w:color="808080" w:sz="4"/>
+              <w:left w:val="single" w:color="808080" w:sz="4"/>
+              <w:bottom w:val="single" w:color="808080" w:sz="4"/>
+              <w:right w:val="single" w:color="808080" w:sz="4"/>
+            </w:tcBorders>
+            <w:tcMar>
+              <w:top w:type="dxa" w:w="120"/>
+              <w:left w:type="dxa" w:w="160"/>
+              <w:bottom w:type="dxa" w:w="120"/>
+              <w:right w:type="dxa" w:w="160"/>
+            </w:tcMar>
+          </w:tcPr>
+          <w:p>
+            <w:pPr>
+              <w:spacing w:after="0" w:line="260"/>
+              <w:jc w:val="left"/>
+            </w:pPr>
+            <w:r>
+              <w:t xml:space="preserve">https://github.com/Machasaikamal</w:t>
             </w:r>
           </w:p>
         </w:tc>
@@ -10872,7 +10672,7 @@
       <w:tr>
         <w:tc>
           <w:tcPr>
-            <w:tcW w:type="dxa" w:w="3060"/>
+            <w:tcW w:type="dxa" w:w="3660"/>
             <w:tcBorders>
               <w:top w:val="single" w:color="808080" w:sz="4"/>
               <w:left w:val="single" w:color="808080" w:sz="4"/>
@@ -10898,88 +10698,27 @@
         </w:tc>
         <w:tc>
           <w:tcPr>
-            <w:tcW w:type="dxa" w:w="2100"/>
-            <w:tcBorders>
-              <w:top w:val="single" w:color="808080" w:sz="4"/>
-              <w:left w:val="single" w:color="808080" w:sz="4"/>
-              <w:bottom w:val="single" w:color="808080" w:sz="4"/>
-              <w:right w:val="single" w:color="808080" w:sz="4"/>
-            </w:tcBorders>
-            <w:tcMar>
-              <w:top w:type="dxa" w:w="120"/>
-              <w:left w:type="dxa" w:w="160"/>
-              <w:bottom w:type="dxa" w:w="120"/>
-              <w:right w:type="dxa" w:w="160"/>
-            </w:tcMar>
-          </w:tcPr>
-          <w:p>
-            <w:pPr>
-              <w:spacing w:after="0" w:line="260"/>
-              <w:jc w:val="left"/>
-            </w:pPr>
-            <w:r>
-              <w:rPr>
-                <w:highlight w:val="yellow"/>
-              </w:rPr>
-              <w:t xml:space="preserve">[link]</w:t>
-            </w:r>
-          </w:p>
-        </w:tc>
-        <w:tc>
-          <w:tcPr>
-            <w:tcW w:type="dxa" w:w="2100"/>
-            <w:tcBorders>
-              <w:top w:val="single" w:color="808080" w:sz="4"/>
-              <w:left w:val="single" w:color="808080" w:sz="4"/>
-              <w:bottom w:val="single" w:color="808080" w:sz="4"/>
-              <w:right w:val="single" w:color="808080" w:sz="4"/>
-            </w:tcBorders>
-            <w:tcMar>
-              <w:top w:type="dxa" w:w="120"/>
-              <w:left w:type="dxa" w:w="160"/>
-              <w:bottom w:type="dxa" w:w="120"/>
-              <w:right w:type="dxa" w:w="160"/>
-            </w:tcMar>
-          </w:tcPr>
-          <w:p>
-            <w:pPr>
-              <w:spacing w:after="0" w:line="260"/>
-              <w:jc w:val="left"/>
-            </w:pPr>
-            <w:r>
-              <w:rPr>
-                <w:highlight w:val="yellow"/>
-              </w:rPr>
-              <w:t xml:space="preserve">[link]</w:t>
-            </w:r>
-          </w:p>
-        </w:tc>
-        <w:tc>
-          <w:tcPr>
-            <w:tcW w:type="dxa" w:w="2100"/>
-            <w:tcBorders>
-              <w:top w:val="single" w:color="808080" w:sz="4"/>
-              <w:left w:val="single" w:color="808080" w:sz="4"/>
-              <w:bottom w:val="single" w:color="808080" w:sz="4"/>
-              <w:right w:val="single" w:color="808080" w:sz="4"/>
-            </w:tcBorders>
-            <w:tcMar>
-              <w:top w:type="dxa" w:w="120"/>
-              <w:left w:type="dxa" w:w="160"/>
-              <w:bottom w:type="dxa" w:w="120"/>
-              <w:right w:type="dxa" w:w="160"/>
-            </w:tcMar>
-          </w:tcPr>
-          <w:p>
-            <w:pPr>
-              <w:spacing w:after="0" w:line="260"/>
-              <w:jc w:val="left"/>
-            </w:pPr>
-            <w:r>
-              <w:rPr>
-                <w:highlight w:val="yellow"/>
-              </w:rPr>
-              <w:t xml:space="preserve">[link]</w:t>
+            <w:tcW w:type="dxa" w:w="5700"/>
+            <w:tcBorders>
+              <w:top w:val="single" w:color="808080" w:sz="4"/>
+              <w:left w:val="single" w:color="808080" w:sz="4"/>
+              <w:bottom w:val="single" w:color="808080" w:sz="4"/>
+              <w:right w:val="single" w:color="808080" w:sz="4"/>
+            </w:tcBorders>
+            <w:tcMar>
+              <w:top w:type="dxa" w:w="120"/>
+              <w:left w:type="dxa" w:w="160"/>
+              <w:bottom w:type="dxa" w:w="120"/>
+              <w:right w:type="dxa" w:w="160"/>
+            </w:tcMar>
+          </w:tcPr>
+          <w:p>
+            <w:pPr>
+              <w:spacing w:after="0" w:line="260"/>
+              <w:jc w:val="left"/>
+            </w:pPr>
+            <w:r>
+              <w:t xml:space="preserve">https://github.com/shahulparvezshaik-stack</w:t>
             </w:r>
           </w:p>
         </w:tc>
@@ -10987,7 +10726,7 @@
       <w:tr>
         <w:tc>
           <w:tcPr>
-            <w:tcW w:type="dxa" w:w="3060"/>
+            <w:tcW w:type="dxa" w:w="3660"/>
             <w:tcBorders>
               <w:top w:val="single" w:color="808080" w:sz="4"/>
               <w:left w:val="single" w:color="808080" w:sz="4"/>
@@ -11013,88 +10752,27 @@
         </w:tc>
         <w:tc>
           <w:tcPr>
-            <w:tcW w:type="dxa" w:w="2100"/>
-            <w:tcBorders>
-              <w:top w:val="single" w:color="808080" w:sz="4"/>
-              <w:left w:val="single" w:color="808080" w:sz="4"/>
-              <w:bottom w:val="single" w:color="808080" w:sz="4"/>
-              <w:right w:val="single" w:color="808080" w:sz="4"/>
-            </w:tcBorders>
-            <w:tcMar>
-              <w:top w:type="dxa" w:w="120"/>
-              <w:left w:type="dxa" w:w="160"/>
-              <w:bottom w:type="dxa" w:w="120"/>
-              <w:right w:type="dxa" w:w="160"/>
-            </w:tcMar>
-          </w:tcPr>
-          <w:p>
-            <w:pPr>
-              <w:spacing w:after="0" w:line="260"/>
-              <w:jc w:val="left"/>
-            </w:pPr>
-            <w:r>
-              <w:rPr>
-                <w:highlight w:val="yellow"/>
-              </w:rPr>
-              <w:t xml:space="preserve">[link]</w:t>
-            </w:r>
-          </w:p>
-        </w:tc>
-        <w:tc>
-          <w:tcPr>
-            <w:tcW w:type="dxa" w:w="2100"/>
-            <w:tcBorders>
-              <w:top w:val="single" w:color="808080" w:sz="4"/>
-              <w:left w:val="single" w:color="808080" w:sz="4"/>
-              <w:bottom w:val="single" w:color="808080" w:sz="4"/>
-              <w:right w:val="single" w:color="808080" w:sz="4"/>
-            </w:tcBorders>
-            <w:tcMar>
-              <w:top w:type="dxa" w:w="120"/>
-              <w:left w:type="dxa" w:w="160"/>
-              <w:bottom w:type="dxa" w:w="120"/>
-              <w:right w:type="dxa" w:w="160"/>
-            </w:tcMar>
-          </w:tcPr>
-          <w:p>
-            <w:pPr>
-              <w:spacing w:after="0" w:line="260"/>
-              <w:jc w:val="left"/>
-            </w:pPr>
-            <w:r>
-              <w:rPr>
-                <w:highlight w:val="yellow"/>
-              </w:rPr>
-              <w:t xml:space="preserve">[link]</w:t>
-            </w:r>
-          </w:p>
-        </w:tc>
-        <w:tc>
-          <w:tcPr>
-            <w:tcW w:type="dxa" w:w="2100"/>
-            <w:tcBorders>
-              <w:top w:val="single" w:color="808080" w:sz="4"/>
-              <w:left w:val="single" w:color="808080" w:sz="4"/>
-              <w:bottom w:val="single" w:color="808080" w:sz="4"/>
-              <w:right w:val="single" w:color="808080" w:sz="4"/>
-            </w:tcBorders>
-            <w:tcMar>
-              <w:top w:type="dxa" w:w="120"/>
-              <w:left w:type="dxa" w:w="160"/>
-              <w:bottom w:type="dxa" w:w="120"/>
-              <w:right w:type="dxa" w:w="160"/>
-            </w:tcMar>
-          </w:tcPr>
-          <w:p>
-            <w:pPr>
-              <w:spacing w:after="0" w:line="260"/>
-              <w:jc w:val="left"/>
-            </w:pPr>
-            <w:r>
-              <w:rPr>
-                <w:highlight w:val="yellow"/>
-              </w:rPr>
-              <w:t xml:space="preserve">[link]</w:t>
+            <w:tcW w:type="dxa" w:w="5700"/>
+            <w:tcBorders>
+              <w:top w:val="single" w:color="808080" w:sz="4"/>
+              <w:left w:val="single" w:color="808080" w:sz="4"/>
+              <w:bottom w:val="single" w:color="808080" w:sz="4"/>
+              <w:right w:val="single" w:color="808080" w:sz="4"/>
+            </w:tcBorders>
+            <w:tcMar>
+              <w:top w:type="dxa" w:w="120"/>
+              <w:left w:type="dxa" w:w="160"/>
+              <w:bottom w:type="dxa" w:w="120"/>
+              <w:right w:type="dxa" w:w="160"/>
+            </w:tcMar>
+          </w:tcPr>
+          <w:p>
+            <w:pPr>
+              <w:spacing w:after="0" w:line="260"/>
+              <w:jc w:val="left"/>
+            </w:pPr>
+            <w:r>
+              <w:t xml:space="preserve">https://github.com/charandamera18-bit</w:t>
             </w:r>
           </w:p>
         </w:tc>
@@ -11112,7 +10790,7 @@
           <w:sz w:val="22"/>
           <w:szCs w:val="22"/>
         </w:rPr>
-        <w:t xml:space="preserve">Table A.1: Deployment Tool Profiles</w:t>
+        <w:t xml:space="preserve">Table A.1: GitHub Profiles</w:t>
       </w:r>
     </w:p>
     <w:p>
@@ -11124,7 +10802,7 @@
         <w:rPr>
           <w:highlight w:val="yellow"/>
         </w:rPr>
-        <w:t xml:space="preserve">[Insert screenshots of each profile.]</w:t>
+        <w:t xml:space="preserve">[Insert screenshots of the repository's Contributors page and closed pull requests.]</w:t>
       </w:r>
     </w:p>
     <w:p>

</xml_diff>

<commit_message>
Report: filled table of contents, target zone as Figure 4.3, print-ready PDF
Co-Authored-By: Claude Opus 5.5 <noreply@anthropic.com>
</commit_message>
<xml_diff>
--- a/report/ForgetBench_Project_Report.docx
+++ b/report/ForgetBench_Project_Report.docx
@@ -635,13 +635,1149 @@
       </w:sdtPr>
       <w:sdtContent>
         <w:p>
+          <w:pPr>
+            <w:tabs>
+              <w:tab w:val="right" w:leader="dot" w:pos="9360"/>
+            </w:tabs>
+            <w:spacing w:before="120" w:after="60"/>
+            <w:ind w:left="0"/>
+          </w:pPr>
           <w:r>
             <w:fldChar w:fldCharType="begin" w:dirty="true"/>
             <w:instrText xml:space="preserve">TOC \h \o "1-3"</w:instrText>
             <w:fldChar w:fldCharType="separate"/>
           </w:r>
+          <w:r>
+            <w:rPr>
+              <w:b/>
+            </w:rPr>
+            <w:t xml:space="preserve">1. INTRODUCTION</w:t>
+          </w:r>
+          <w:r>
+            <w:rPr>
+              <w:b/>
+            </w:rPr>
+            <w:tab/>
+          </w:r>
+          <w:r>
+            <w:rPr>
+              <w:b/>
+            </w:rPr>
+            <w:t>1</w:t>
+          </w:r>
         </w:p>
         <w:p>
+          <w:pPr>
+            <w:tabs>
+              <w:tab w:val="right" w:leader="dot" w:pos="9360"/>
+            </w:tabs>
+            <w:spacing w:before="0" w:after="60"/>
+            <w:ind w:left="440"/>
+          </w:pPr>
+          <w:r>
+            <w:rPr/>
+            <w:t xml:space="preserve">1.1 Background</w:t>
+          </w:r>
+          <w:r>
+            <w:rPr/>
+            <w:tab/>
+          </w:r>
+          <w:r>
+            <w:rPr/>
+            <w:t>1</w:t>
+          </w:r>
+        </w:p>
+        <w:p>
+          <w:pPr>
+            <w:tabs>
+              <w:tab w:val="right" w:leader="dot" w:pos="9360"/>
+            </w:tabs>
+            <w:spacing w:before="0" w:after="60"/>
+            <w:ind w:left="440"/>
+          </w:pPr>
+          <w:r>
+            <w:rPr/>
+            <w:t xml:space="preserve">1.2 Motivation</w:t>
+          </w:r>
+          <w:r>
+            <w:rPr/>
+            <w:tab/>
+          </w:r>
+          <w:r>
+            <w:rPr/>
+            <w:t>1</w:t>
+          </w:r>
+        </w:p>
+        <w:p>
+          <w:pPr>
+            <w:tabs>
+              <w:tab w:val="right" w:leader="dot" w:pos="9360"/>
+            </w:tabs>
+            <w:spacing w:before="0" w:after="60"/>
+            <w:ind w:left="440"/>
+          </w:pPr>
+          <w:r>
+            <w:rPr/>
+            <w:t xml:space="preserve">1.3 Problem Statement</w:t>
+          </w:r>
+          <w:r>
+            <w:rPr/>
+            <w:tab/>
+          </w:r>
+          <w:r>
+            <w:rPr/>
+            <w:t>2</w:t>
+          </w:r>
+        </w:p>
+        <w:p>
+          <w:pPr>
+            <w:tabs>
+              <w:tab w:val="right" w:leader="dot" w:pos="9360"/>
+            </w:tabs>
+            <w:spacing w:before="0" w:after="60"/>
+            <w:ind w:left="440"/>
+          </w:pPr>
+          <w:r>
+            <w:rPr/>
+            <w:t xml:space="preserve">1.4 Objectives</w:t>
+          </w:r>
+          <w:r>
+            <w:rPr/>
+            <w:tab/>
+          </w:r>
+          <w:r>
+            <w:rPr/>
+            <w:t>2</w:t>
+          </w:r>
+        </w:p>
+        <w:p>
+          <w:pPr>
+            <w:tabs>
+              <w:tab w:val="right" w:leader="dot" w:pos="9360"/>
+            </w:tabs>
+            <w:spacing w:before="0" w:after="60"/>
+            <w:ind w:left="440"/>
+          </w:pPr>
+          <w:r>
+            <w:rPr/>
+            <w:t xml:space="preserve">1.5 Dataset Overview</w:t>
+          </w:r>
+          <w:r>
+            <w:rPr/>
+            <w:tab/>
+          </w:r>
+          <w:r>
+            <w:rPr/>
+            <w:t>2</w:t>
+          </w:r>
+        </w:p>
+        <w:p>
+          <w:pPr>
+            <w:tabs>
+              <w:tab w:val="right" w:leader="dot" w:pos="9360"/>
+            </w:tabs>
+            <w:spacing w:before="0" w:after="60"/>
+            <w:ind w:left="440"/>
+          </w:pPr>
+          <w:r>
+            <w:rPr/>
+            <w:t xml:space="preserve">1.6 Scope and Limitations</w:t>
+          </w:r>
+          <w:r>
+            <w:rPr/>
+            <w:tab/>
+          </w:r>
+          <w:r>
+            <w:rPr/>
+            <w:t>3</w:t>
+          </w:r>
+        </w:p>
+        <w:p>
+          <w:pPr>
+            <w:tabs>
+              <w:tab w:val="right" w:leader="dot" w:pos="9360"/>
+            </w:tabs>
+            <w:spacing w:before="0" w:after="60"/>
+            <w:ind w:left="440"/>
+          </w:pPr>
+          <w:r>
+            <w:rPr/>
+            <w:t xml:space="preserve">1.7 Organization of the Report</w:t>
+          </w:r>
+          <w:r>
+            <w:rPr/>
+            <w:tab/>
+          </w:r>
+          <w:r>
+            <w:rPr/>
+            <w:t>3</w:t>
+          </w:r>
+        </w:p>
+        <w:p>
+          <w:pPr>
+            <w:tabs>
+              <w:tab w:val="right" w:leader="dot" w:pos="9360"/>
+            </w:tabs>
+            <w:spacing w:before="120" w:after="60"/>
+            <w:ind w:left="0"/>
+          </w:pPr>
+          <w:r>
+            <w:rPr>
+              <w:b/>
+            </w:rPr>
+            <w:t xml:space="preserve">2. LITERATURE REVIEW</w:t>
+          </w:r>
+          <w:r>
+            <w:rPr>
+              <w:b/>
+            </w:rPr>
+            <w:tab/>
+          </w:r>
+          <w:r>
+            <w:rPr>
+              <w:b/>
+            </w:rPr>
+            <w:t>4</w:t>
+          </w:r>
+        </w:p>
+        <w:p>
+          <w:pPr>
+            <w:tabs>
+              <w:tab w:val="right" w:leader="dot" w:pos="9360"/>
+            </w:tabs>
+            <w:spacing w:before="0" w:after="60"/>
+            <w:ind w:left="440"/>
+          </w:pPr>
+          <w:r>
+            <w:rPr/>
+            <w:t xml:space="preserve">2.1 Machine Unlearning and Exact Removal</w:t>
+          </w:r>
+          <w:r>
+            <w:rPr/>
+            <w:tab/>
+          </w:r>
+          <w:r>
+            <w:rPr/>
+            <w:t>4</w:t>
+          </w:r>
+        </w:p>
+        <w:p>
+          <w:pPr>
+            <w:tabs>
+              <w:tab w:val="right" w:leader="dot" w:pos="9360"/>
+            </w:tabs>
+            <w:spacing w:before="0" w:after="60"/>
+            <w:ind w:left="440"/>
+          </w:pPr>
+          <w:r>
+            <w:rPr/>
+            <w:t xml:space="preserve">2.2 Approximate Unlearning for Language Models</w:t>
+          </w:r>
+          <w:r>
+            <w:rPr/>
+            <w:tab/>
+          </w:r>
+          <w:r>
+            <w:rPr/>
+            <w:t>4</w:t>
+          </w:r>
+        </w:p>
+        <w:p>
+          <w:pPr>
+            <w:tabs>
+              <w:tab w:val="right" w:leader="dot" w:pos="9360"/>
+            </w:tabs>
+            <w:spacing w:before="0" w:after="60"/>
+            <w:ind w:left="440"/>
+          </w:pPr>
+          <w:r>
+            <w:rPr/>
+            <w:t xml:space="preserve">2.3 Benchmarks for Unlearning</w:t>
+          </w:r>
+          <w:r>
+            <w:rPr/>
+            <w:tab/>
+          </w:r>
+          <w:r>
+            <w:rPr/>
+            <w:t>4</w:t>
+          </w:r>
+        </w:p>
+        <w:p>
+          <w:pPr>
+            <w:tabs>
+              <w:tab w:val="right" w:leader="dot" w:pos="9360"/>
+            </w:tabs>
+            <w:spacing w:before="0" w:after="60"/>
+            <w:ind w:left="440"/>
+          </w:pPr>
+          <w:r>
+            <w:rPr/>
+            <w:t xml:space="preserve">2.4 Relearning Attacks and Reversibility</w:t>
+          </w:r>
+          <w:r>
+            <w:rPr/>
+            <w:tab/>
+          </w:r>
+          <w:r>
+            <w:rPr/>
+            <w:t>5</w:t>
+          </w:r>
+        </w:p>
+        <w:p>
+          <w:pPr>
+            <w:tabs>
+              <w:tab w:val="right" w:leader="dot" w:pos="9360"/>
+            </w:tabs>
+            <w:spacing w:before="0" w:after="60"/>
+            <w:ind w:left="440"/>
+          </w:pPr>
+          <w:r>
+            <w:rPr/>
+            <w:t xml:space="preserve">2.5 Robust Unlearning</w:t>
+          </w:r>
+          <w:r>
+            <w:rPr/>
+            <w:tab/>
+          </w:r>
+          <w:r>
+            <w:rPr/>
+            <w:t>5</w:t>
+          </w:r>
+        </w:p>
+        <w:p>
+          <w:pPr>
+            <w:tabs>
+              <w:tab w:val="right" w:leader="dot" w:pos="9360"/>
+            </w:tabs>
+            <w:spacing w:before="0" w:after="60"/>
+            <w:ind w:left="440"/>
+          </w:pPr>
+          <w:r>
+            <w:rPr/>
+            <w:t xml:space="preserve">2.6 Measuring Privacy Leakage</w:t>
+          </w:r>
+          <w:r>
+            <w:rPr/>
+            <w:tab/>
+          </w:r>
+          <w:r>
+            <w:rPr/>
+            <w:t>5</w:t>
+          </w:r>
+        </w:p>
+        <w:p>
+          <w:pPr>
+            <w:tabs>
+              <w:tab w:val="right" w:leader="dot" w:pos="9360"/>
+            </w:tabs>
+            <w:spacing w:before="0" w:after="60"/>
+            <w:ind w:left="440"/>
+          </w:pPr>
+          <w:r>
+            <w:rPr/>
+            <w:t xml:space="preserve">2.7 Research Gap</w:t>
+          </w:r>
+          <w:r>
+            <w:rPr/>
+            <w:tab/>
+          </w:r>
+          <w:r>
+            <w:rPr/>
+            <w:t>5</w:t>
+          </w:r>
+        </w:p>
+        <w:p>
+          <w:pPr>
+            <w:tabs>
+              <w:tab w:val="right" w:leader="dot" w:pos="9360"/>
+            </w:tabs>
+            <w:spacing w:before="120" w:after="60"/>
+            <w:ind w:left="0"/>
+          </w:pPr>
+          <w:r>
+            <w:rPr>
+              <w:b/>
+            </w:rPr>
+            <w:t xml:space="preserve">3. METHODOLOGY</w:t>
+          </w:r>
+          <w:r>
+            <w:rPr>
+              <w:b/>
+            </w:rPr>
+            <w:tab/>
+          </w:r>
+          <w:r>
+            <w:rPr>
+              <w:b/>
+            </w:rPr>
+            <w:t>7</w:t>
+          </w:r>
+        </w:p>
+        <w:p>
+          <w:pPr>
+            <w:tabs>
+              <w:tab w:val="right" w:leader="dot" w:pos="9360"/>
+            </w:tabs>
+            <w:spacing w:before="0" w:after="60"/>
+            <w:ind w:left="440"/>
+          </w:pPr>
+          <w:r>
+            <w:rPr/>
+            <w:t xml:space="preserve">3.1 System Overview</w:t>
+          </w:r>
+          <w:r>
+            <w:rPr/>
+            <w:tab/>
+          </w:r>
+          <w:r>
+            <w:rPr/>
+            <w:t>7</w:t>
+          </w:r>
+        </w:p>
+        <w:p>
+          <w:pPr>
+            <w:tabs>
+              <w:tab w:val="right" w:leader="dot" w:pos="9360"/>
+            </w:tabs>
+            <w:spacing w:before="0" w:after="60"/>
+            <w:ind w:left="440"/>
+          </w:pPr>
+          <w:r>
+            <w:rPr/>
+            <w:t xml:space="preserve">3.2 Synthetic Data Generation</w:t>
+          </w:r>
+          <w:r>
+            <w:rPr/>
+            <w:tab/>
+          </w:r>
+          <w:r>
+            <w:rPr/>
+            <w:t>7</w:t>
+          </w:r>
+        </w:p>
+        <w:p>
+          <w:pPr>
+            <w:tabs>
+              <w:tab w:val="right" w:leader="dot" w:pos="9360"/>
+            </w:tabs>
+            <w:spacing w:before="0" w:after="60"/>
+            <w:ind w:left="440"/>
+          </w:pPr>
+          <w:r>
+            <w:rPr/>
+            <w:t xml:space="preserve">3.3 Base Model and Fine-tuning</w:t>
+          </w:r>
+          <w:r>
+            <w:rPr/>
+            <w:tab/>
+          </w:r>
+          <w:r>
+            <w:rPr/>
+            <w:t>8</w:t>
+          </w:r>
+        </w:p>
+        <w:p>
+          <w:pPr>
+            <w:tabs>
+              <w:tab w:val="right" w:leader="dot" w:pos="9360"/>
+            </w:tabs>
+            <w:spacing w:before="0" w:after="60"/>
+            <w:ind w:left="440"/>
+          </w:pPr>
+          <w:r>
+            <w:rPr/>
+            <w:t xml:space="preserve">3.4 Unlearning Methods Compared</w:t>
+          </w:r>
+          <w:r>
+            <w:rPr/>
+            <w:tab/>
+          </w:r>
+          <w:r>
+            <w:rPr/>
+            <w:t>8</w:t>
+          </w:r>
+        </w:p>
+        <w:p>
+          <w:pPr>
+            <w:tabs>
+              <w:tab w:val="right" w:leader="dot" w:pos="9360"/>
+            </w:tabs>
+            <w:spacing w:before="0" w:after="60"/>
+            <w:ind w:left="440"/>
+          </w:pPr>
+          <w:r>
+            <w:rPr/>
+            <w:t xml:space="preserve">3.5 Hybrid Retention-aware Unlearning (HRU)</w:t>
+          </w:r>
+          <w:r>
+            <w:rPr/>
+            <w:tab/>
+          </w:r>
+          <w:r>
+            <w:rPr/>
+            <w:t>9</w:t>
+          </w:r>
+        </w:p>
+        <w:p>
+          <w:pPr>
+            <w:tabs>
+              <w:tab w:val="right" w:leader="dot" w:pos="9360"/>
+            </w:tabs>
+            <w:spacing w:before="0" w:after="60"/>
+            <w:ind w:left="880"/>
+          </w:pPr>
+          <w:r>
+            <w:rPr/>
+            <w:t xml:space="preserve">3.5.1 Localisation</w:t>
+          </w:r>
+          <w:r>
+            <w:rPr/>
+            <w:tab/>
+          </w:r>
+          <w:r>
+            <w:rPr/>
+            <w:t>9</w:t>
+          </w:r>
+        </w:p>
+        <w:p>
+          <w:pPr>
+            <w:tabs>
+              <w:tab w:val="right" w:leader="dot" w:pos="9360"/>
+            </w:tabs>
+            <w:spacing w:before="0" w:after="60"/>
+            <w:ind w:left="880"/>
+          </w:pPr>
+          <w:r>
+            <w:rPr/>
+            <w:t xml:space="preserve">3.5.2 Sharpness-aware NPO scrub</w:t>
+          </w:r>
+          <w:r>
+            <w:rPr/>
+            <w:tab/>
+          </w:r>
+          <w:r>
+            <w:rPr/>
+            <w:t>10</w:t>
+          </w:r>
+        </w:p>
+        <w:p>
+          <w:pPr>
+            <w:tabs>
+              <w:tab w:val="right" w:leader="dot" w:pos="9360"/>
+            </w:tabs>
+            <w:spacing w:before="0" w:after="60"/>
+            <w:ind w:left="880"/>
+          </w:pPr>
+          <w:r>
+            <w:rPr/>
+            <w:t xml:space="preserve">3.5.3 Hardening loop</w:t>
+          </w:r>
+          <w:r>
+            <w:rPr/>
+            <w:tab/>
+          </w:r>
+          <w:r>
+            <w:rPr/>
+            <w:t>10</w:t>
+          </w:r>
+        </w:p>
+        <w:p>
+          <w:pPr>
+            <w:tabs>
+              <w:tab w:val="right" w:leader="dot" w:pos="9360"/>
+            </w:tabs>
+            <w:spacing w:before="0" w:after="60"/>
+            <w:ind w:left="440"/>
+          </w:pPr>
+          <w:r>
+            <w:rPr/>
+            <w:t xml:space="preserve">3.6 Relearning Attack</w:t>
+          </w:r>
+          <w:r>
+            <w:rPr/>
+            <w:tab/>
+          </w:r>
+          <w:r>
+            <w:rPr/>
+            <w:t>10</w:t>
+          </w:r>
+        </w:p>
+        <w:p>
+          <w:pPr>
+            <w:tabs>
+              <w:tab w:val="right" w:leader="dot" w:pos="9360"/>
+            </w:tabs>
+            <w:spacing w:before="0" w:after="60"/>
+            <w:ind w:left="440"/>
+          </w:pPr>
+          <w:r>
+            <w:rPr/>
+            <w:t xml:space="preserve">3.7 Evaluation Metrics</w:t>
+          </w:r>
+          <w:r>
+            <w:rPr/>
+            <w:tab/>
+          </w:r>
+          <w:r>
+            <w:rPr/>
+            <w:t>11</w:t>
+          </w:r>
+        </w:p>
+        <w:p>
+          <w:pPr>
+            <w:tabs>
+              <w:tab w:val="right" w:leader="dot" w:pos="9360"/>
+            </w:tabs>
+            <w:spacing w:before="0" w:after="60"/>
+            <w:ind w:left="440"/>
+          </w:pPr>
+          <w:r>
+            <w:rPr/>
+            <w:t xml:space="preserve">3.8 Training Configuration</w:t>
+          </w:r>
+          <w:r>
+            <w:rPr/>
+            <w:tab/>
+          </w:r>
+          <w:r>
+            <w:rPr/>
+            <w:t>11</w:t>
+          </w:r>
+        </w:p>
+        <w:p>
+          <w:pPr>
+            <w:tabs>
+              <w:tab w:val="right" w:leader="dot" w:pos="9360"/>
+            </w:tabs>
+            <w:spacing w:before="0" w:after="60"/>
+            <w:ind w:left="440"/>
+          </w:pPr>
+          <w:r>
+            <w:rPr/>
+            <w:t xml:space="preserve">3.9 Implementation Details</w:t>
+          </w:r>
+          <w:r>
+            <w:rPr/>
+            <w:tab/>
+          </w:r>
+          <w:r>
+            <w:rPr/>
+            <w:t>12</w:t>
+          </w:r>
+        </w:p>
+        <w:p>
+          <w:pPr>
+            <w:tabs>
+              <w:tab w:val="right" w:leader="dot" w:pos="9360"/>
+            </w:tabs>
+            <w:spacing w:before="120" w:after="60"/>
+            <w:ind w:left="0"/>
+          </w:pPr>
+          <w:r>
+            <w:rPr>
+              <w:b/>
+            </w:rPr>
+            <w:t xml:space="preserve">4. RESULTS AND DISCUSSION</w:t>
+          </w:r>
+          <w:r>
+            <w:rPr>
+              <w:b/>
+            </w:rPr>
+            <w:tab/>
+          </w:r>
+          <w:r>
+            <w:rPr>
+              <w:b/>
+            </w:rPr>
+            <w:t>13</w:t>
+          </w:r>
+        </w:p>
+        <w:p>
+          <w:pPr>
+            <w:tabs>
+              <w:tab w:val="right" w:leader="dot" w:pos="9360"/>
+            </w:tabs>
+            <w:spacing w:before="0" w:after="60"/>
+            <w:ind w:left="440"/>
+          </w:pPr>
+          <w:r>
+            <w:rPr/>
+            <w:t xml:space="preserve">4.1 Overall Comparison</w:t>
+          </w:r>
+          <w:r>
+            <w:rPr/>
+            <w:tab/>
+          </w:r>
+          <w:r>
+            <w:rPr/>
+            <w:t>13</w:t>
+          </w:r>
+        </w:p>
+        <w:p>
+          <w:pPr>
+            <w:tabs>
+              <w:tab w:val="right" w:leader="dot" w:pos="9360"/>
+            </w:tabs>
+            <w:spacing w:before="0" w:after="60"/>
+            <w:ind w:left="440"/>
+          </w:pPr>
+          <w:r>
+            <w:rPr/>
+            <w:t xml:space="preserve">4.2 Effect of Sharding</w:t>
+          </w:r>
+          <w:r>
+            <w:rPr/>
+            <w:tab/>
+          </w:r>
+          <w:r>
+            <w:rPr/>
+            <w:t>14</w:t>
+          </w:r>
+        </w:p>
+        <w:p>
+          <w:pPr>
+            <w:tabs>
+              <w:tab w:val="right" w:leader="dot" w:pos="9360"/>
+            </w:tabs>
+            <w:spacing w:before="0" w:after="60"/>
+            <w:ind w:left="440"/>
+          </w:pPr>
+          <w:r>
+            <w:rPr/>
+            <w:t xml:space="preserve">4.3 Utility and Over-forgetting</w:t>
+          </w:r>
+          <w:r>
+            <w:rPr/>
+            <w:tab/>
+          </w:r>
+          <w:r>
+            <w:rPr/>
+            <w:t>15</w:t>
+          </w:r>
+        </w:p>
+        <w:p>
+          <w:pPr>
+            <w:tabs>
+              <w:tab w:val="right" w:leader="dot" w:pos="9360"/>
+            </w:tabs>
+            <w:spacing w:before="0" w:after="60"/>
+            <w:ind w:left="440"/>
+          </w:pPr>
+          <w:r>
+            <w:rPr/>
+            <w:t xml:space="preserve">4.4 Validity of the Durability Metric</w:t>
+          </w:r>
+          <w:r>
+            <w:rPr/>
+            <w:tab/>
+          </w:r>
+          <w:r>
+            <w:rPr/>
+            <w:t>16</w:t>
+          </w:r>
+        </w:p>
+        <w:p>
+          <w:pPr>
+            <w:tabs>
+              <w:tab w:val="right" w:leader="dot" w:pos="9360"/>
+            </w:tabs>
+            <w:spacing w:before="0" w:after="60"/>
+            <w:ind w:left="440"/>
+          </w:pPr>
+          <w:r>
+            <w:rPr/>
+            <w:t xml:space="preserve">4.5 Cost Analysis</w:t>
+          </w:r>
+          <w:r>
+            <w:rPr/>
+            <w:tab/>
+          </w:r>
+          <w:r>
+            <w:rPr/>
+            <w:t>18</w:t>
+          </w:r>
+        </w:p>
+        <w:p>
+          <w:pPr>
+            <w:tabs>
+              <w:tab w:val="right" w:leader="dot" w:pos="9360"/>
+            </w:tabs>
+            <w:spacing w:before="0" w:after="60"/>
+            <w:ind w:left="440"/>
+          </w:pPr>
+          <w:r>
+            <w:rPr/>
+            <w:t xml:space="preserve">4.6 Testing and Validation</w:t>
+          </w:r>
+          <w:r>
+            <w:rPr/>
+            <w:tab/>
+          </w:r>
+          <w:r>
+            <w:rPr/>
+            <w:t>18</w:t>
+          </w:r>
+        </w:p>
+        <w:p>
+          <w:pPr>
+            <w:tabs>
+              <w:tab w:val="right" w:leader="dot" w:pos="9360"/>
+            </w:tabs>
+            <w:spacing w:before="0" w:after="60"/>
+            <w:ind w:left="440"/>
+          </w:pPr>
+          <w:r>
+            <w:rPr/>
+            <w:t xml:space="preserve">4.7 Discussion</w:t>
+          </w:r>
+          <w:r>
+            <w:rPr/>
+            <w:tab/>
+          </w:r>
+          <w:r>
+            <w:rPr/>
+            <w:t>19</w:t>
+          </w:r>
+        </w:p>
+        <w:p>
+          <w:pPr>
+            <w:tabs>
+              <w:tab w:val="right" w:leader="dot" w:pos="9360"/>
+            </w:tabs>
+            <w:spacing w:before="120" w:after="60"/>
+            <w:ind w:left="0"/>
+          </w:pPr>
+          <w:r>
+            <w:rPr>
+              <w:b/>
+            </w:rPr>
+            <w:t xml:space="preserve">5. CONCLUSION AND FUTURE WORK</w:t>
+          </w:r>
+          <w:r>
+            <w:rPr>
+              <w:b/>
+            </w:rPr>
+            <w:tab/>
+          </w:r>
+          <w:r>
+            <w:rPr>
+              <w:b/>
+            </w:rPr>
+            <w:t>21</w:t>
+          </w:r>
+        </w:p>
+        <w:p>
+          <w:pPr>
+            <w:tabs>
+              <w:tab w:val="right" w:leader="dot" w:pos="9360"/>
+            </w:tabs>
+            <w:spacing w:before="0" w:after="60"/>
+            <w:ind w:left="440"/>
+          </w:pPr>
+          <w:r>
+            <w:rPr/>
+            <w:t xml:space="preserve">5.1 Summary of Contributions</w:t>
+          </w:r>
+          <w:r>
+            <w:rPr/>
+            <w:tab/>
+          </w:r>
+          <w:r>
+            <w:rPr/>
+            <w:t>21</w:t>
+          </w:r>
+        </w:p>
+        <w:p>
+          <w:pPr>
+            <w:tabs>
+              <w:tab w:val="right" w:leader="dot" w:pos="9360"/>
+            </w:tabs>
+            <w:spacing w:before="0" w:after="60"/>
+            <w:ind w:left="440"/>
+          </w:pPr>
+          <w:r>
+            <w:rPr/>
+            <w:t xml:space="preserve">5.2 Limitations</w:t>
+          </w:r>
+          <w:r>
+            <w:rPr/>
+            <w:tab/>
+          </w:r>
+          <w:r>
+            <w:rPr/>
+            <w:t>21</w:t>
+          </w:r>
+        </w:p>
+        <w:p>
+          <w:pPr>
+            <w:tabs>
+              <w:tab w:val="right" w:leader="dot" w:pos="9360"/>
+            </w:tabs>
+            <w:spacing w:before="0" w:after="60"/>
+            <w:ind w:left="440"/>
+          </w:pPr>
+          <w:r>
+            <w:rPr/>
+            <w:t xml:space="preserve">5.3 Future Work</w:t>
+          </w:r>
+          <w:r>
+            <w:rPr/>
+            <w:tab/>
+          </w:r>
+          <w:r>
+            <w:rPr/>
+            <w:t>21</w:t>
+          </w:r>
+        </w:p>
+        <w:p>
+          <w:pPr>
+            <w:tabs>
+              <w:tab w:val="right" w:leader="dot" w:pos="9360"/>
+            </w:tabs>
+            <w:spacing w:before="0" w:after="60"/>
+            <w:ind w:left="880"/>
+          </w:pPr>
+          <w:r>
+            <w:rPr/>
+            <w:t xml:space="preserve">5.3.1 Equal-budget validation</w:t>
+          </w:r>
+          <w:r>
+            <w:rPr/>
+            <w:tab/>
+          </w:r>
+          <w:r>
+            <w:rPr/>
+            <w:t>21</w:t>
+          </w:r>
+        </w:p>
+        <w:p>
+          <w:pPr>
+            <w:tabs>
+              <w:tab w:val="right" w:leader="dot" w:pos="9360"/>
+            </w:tabs>
+            <w:spacing w:before="0" w:after="60"/>
+            <w:ind w:left="880"/>
+          </w:pPr>
+          <w:r>
+            <w:rPr/>
+            <w:t xml:space="preserve">5.3.2 Fact-level evaluation</w:t>
+          </w:r>
+          <w:r>
+            <w:rPr/>
+            <w:tab/>
+          </w:r>
+          <w:r>
+            <w:rPr/>
+            <w:t>22</w:t>
+          </w:r>
+        </w:p>
+        <w:p>
+          <w:pPr>
+            <w:tabs>
+              <w:tab w:val="right" w:leader="dot" w:pos="9360"/>
+            </w:tabs>
+            <w:spacing w:before="0" w:after="60"/>
+            <w:ind w:left="880"/>
+          </w:pPr>
+          <w:r>
+            <w:rPr/>
+            <w:t xml:space="preserve">5.3.3 Shard aggregation</w:t>
+          </w:r>
+          <w:r>
+            <w:rPr/>
+            <w:tab/>
+          </w:r>
+          <w:r>
+            <w:rPr/>
+            <w:t>22</w:t>
+          </w:r>
+        </w:p>
+        <w:p>
+          <w:pPr>
+            <w:tabs>
+              <w:tab w:val="right" w:leader="dot" w:pos="9360"/>
+            </w:tabs>
+            <w:spacing w:before="0" w:after="60"/>
+            <w:ind w:left="880"/>
+          </w:pPr>
+          <w:r>
+            <w:rPr/>
+            <w:t xml:space="preserve">5.3.4 Scale and realistic data</w:t>
+          </w:r>
+          <w:r>
+            <w:rPr/>
+            <w:tab/>
+          </w:r>
+          <w:r>
+            <w:rPr/>
+            <w:t>22</w:t>
+          </w:r>
+        </w:p>
+        <w:p>
+          <w:pPr>
+            <w:tabs>
+              <w:tab w:val="right" w:leader="dot" w:pos="9360"/>
+            </w:tabs>
+            <w:spacing w:before="0" w:after="60"/>
+            <w:ind w:left="880"/>
+          </w:pPr>
+          <w:r>
+            <w:rPr/>
+            <w:t xml:space="preserve">5.3.5 Cost reduction</w:t>
+          </w:r>
+          <w:r>
+            <w:rPr/>
+            <w:tab/>
+          </w:r>
+          <w:r>
+            <w:rPr/>
+            <w:t>22</w:t>
+          </w:r>
+        </w:p>
+        <w:p>
+          <w:pPr>
+            <w:tabs>
+              <w:tab w:val="right" w:leader="dot" w:pos="9360"/>
+            </w:tabs>
+            <w:spacing w:before="0" w:after="60"/>
+            <w:ind w:left="440"/>
+          </w:pPr>
+          <w:r>
+            <w:rPr/>
+            <w:t xml:space="preserve">5.4 Concluding Remarks</w:t>
+          </w:r>
+          <w:r>
+            <w:rPr/>
+            <w:tab/>
+          </w:r>
+          <w:r>
+            <w:rPr/>
+            <w:t>22</w:t>
+          </w:r>
+        </w:p>
+        <w:p>
+          <w:pPr>
+            <w:tabs>
+              <w:tab w:val="right" w:leader="dot" w:pos="9360"/>
+            </w:tabs>
+            <w:spacing w:before="120" w:after="60"/>
+            <w:ind w:left="0"/>
+          </w:pPr>
+          <w:r>
+            <w:rPr>
+              <w:b/>
+            </w:rPr>
+            <w:t xml:space="preserve">REFERENCES</w:t>
+          </w:r>
+          <w:r>
+            <w:rPr>
+              <w:b/>
+            </w:rPr>
+            <w:tab/>
+          </w:r>
+          <w:r>
+            <w:rPr>
+              <w:b/>
+            </w:rPr>
+            <w:t>23</w:t>
+          </w:r>
+        </w:p>
+        <w:p>
+          <w:pPr>
+            <w:tabs>
+              <w:tab w:val="right" w:leader="dot" w:pos="9360"/>
+            </w:tabs>
+            <w:spacing w:before="120" w:after="60"/>
+            <w:ind w:left="0"/>
+          </w:pPr>
+          <w:r>
+            <w:rPr>
+              <w:b/>
+            </w:rPr>
+            <w:t xml:space="preserve">APPENDIX – I</w:t>
+          </w:r>
+          <w:r>
+            <w:rPr>
+              <w:b/>
+            </w:rPr>
+            <w:tab/>
+          </w:r>
+          <w:r>
+            <w:rPr>
+              <w:b/>
+            </w:rPr>
+            <w:t>25</w:t>
+          </w:r>
+        </w:p>
+        <w:p>
+          <w:pPr>
+            <w:tabs>
+              <w:tab w:val="right" w:leader="dot" w:pos="9360"/>
+            </w:tabs>
+            <w:spacing w:before="0" w:after="60"/>
+            <w:ind w:left="440"/>
+          </w:pPr>
+          <w:r>
+            <w:rPr/>
+            <w:t xml:space="preserve">I.1 Screenshots of Work Done</w:t>
+          </w:r>
+          <w:r>
+            <w:rPr/>
+            <w:tab/>
+          </w:r>
+          <w:r>
+            <w:rPr/>
+            <w:t>25</w:t>
+          </w:r>
+        </w:p>
+        <w:p>
+          <w:pPr>
+            <w:tabs>
+              <w:tab w:val="right" w:leader="dot" w:pos="9360"/>
+            </w:tabs>
+            <w:spacing w:before="0" w:after="60"/>
+            <w:ind w:left="440"/>
+          </w:pPr>
+          <w:r>
+            <w:rPr/>
+            <w:t xml:space="preserve">I.2 GitHub Repository</w:t>
+          </w:r>
+          <w:r>
+            <w:rPr/>
+            <w:tab/>
+          </w:r>
+          <w:r>
+            <w:rPr/>
+            <w:t>25</w:t>
+          </w:r>
+        </w:p>
+        <w:p>
+          <w:pPr>
+            <w:tabs>
+              <w:tab w:val="right" w:leader="dot" w:pos="9360"/>
+            </w:tabs>
+            <w:spacing w:before="120" w:after="60"/>
+            <w:ind w:left="0"/>
+          </w:pPr>
+          <w:r>
+            <w:rPr>
+              <w:b/>
+            </w:rPr>
+            <w:t xml:space="preserve">APPENDIX – II</w:t>
+          </w:r>
+          <w:r>
+            <w:rPr>
+              <w:b/>
+            </w:rPr>
+            <w:tab/>
+          </w:r>
+          <w:r>
+            <w:rPr>
+              <w:b/>
+            </w:rPr>
+            <w:t>26</w:t>
+          </w:r>
           <w:r>
             <w:fldChar w:fldCharType="end"/>
           </w:r>
@@ -830,7 +1966,7 @@
         <w:jc w:val="left"/>
       </w:pPr>
       <w:r>
-        <w:t xml:space="preserve">Figure 4.3: Durability Versus Model Damage</w:t>
+        <w:t xml:space="preserve">Figure 4.3: Cost-Durability Target Zone</w:t>
       </w:r>
     </w:p>
     <w:p>
@@ -839,7 +1975,7 @@
         <w:jc w:val="left"/>
       </w:pPr>
       <w:r>
-        <w:t xml:space="preserve">Figure 4.4: Cost-Durability Target Zone</w:t>
+        <w:t xml:space="preserve">Figure 4.4: Durability Versus Model Damage</w:t>
       </w:r>
     </w:p>
     <w:p>
@@ -7613,20 +8749,11 @@
     </w:p>
     <w:p>
       <w:pPr>
-        <w:pStyle w:val="Heading2"/>
-        <w:keepNext/>
-      </w:pPr>
-      <w:r>
-        <w:t xml:space="preserve">4.4 Validity of the Durability Metric</w:t>
-      </w:r>
-    </w:p>
-    <w:p>
-      <w:pPr>
         <w:spacing w:after="120" w:before="0" w:line="360"/>
         <w:jc w:val="both"/>
       </w:pPr>
       <w:r>
-        <w:t xml:space="preserve">Because the most durable methods were also the most damaging, we tested whether the durability metric simply rewards damage. Across all twelve variants, durability correlates with retain-set degradation at r = +0.88 (Figure 4.3).</w:t>
+        <w:t xml:space="preserve">Figure 4.3 places every method on cost and durability together. The shaded target zone marks the region the project aims for: durability between -0.60 and -1.56, that is, at least as durable as full retraining (-0.582), at a cost below full retraining (150 updates). Unsharded HRU lies inside the zone and is the most durable method in it, at -1.309 with 120 updates, 80% of the cost of retraining.</w:t>
       </w:r>
     </w:p>
     <w:p>
@@ -7638,7 +8765,7 @@
       <w:r>
         <w:drawing>
           <wp:inline distT="0" distB="0" distL="0" distR="0">
-            <wp:extent cx="5334000" cy="3286125"/>
+            <wp:extent cx="5334000" cy="3448050"/>
             <wp:effectExtent t="0" r="0" b="0" l="0"/>
             <wp:docPr id="6" name="" descr="" title=""/>
             <wp:cNvGraphicFramePr>
@@ -7663,7 +8790,7 @@
                   <pic:spPr bwMode="auto">
                     <a:xfrm>
                       <a:off x="0" y="0"/>
-                      <a:ext cx="5334000" cy="3286125"/>
+                      <a:ext cx="5334000" cy="3448050"/>
                     </a:xfrm>
                     <a:prstGeom prst="rect">
                       <a:avLst/>
@@ -7688,7 +8815,7 @@
           <w:sz w:val="22"/>
           <w:szCs w:val="22"/>
         </w:rPr>
-        <w:t xml:space="preserve">Figure 4.3: Durability Versus Model Damage</w:t>
+        <w:t xml:space="preserve">Figure 4.3: Cost-Durability Target Zone</w:t>
       </w:r>
     </w:p>
     <w:p>
@@ -7697,620 +8824,16 @@
         <w:jc w:val="both"/>
       </w:pPr>
       <w:r>
-        <w:t xml:space="preserve">The cause is that the metric averages the log-probability of the whole answer sentence, of which only one or two tokens are the fact; a method that suppresses the answer template as a whole scores well. To separate the two effects, Table 4.3 reports each method's residual from the least-squares fit: how much more (negative) or less (positive) durable it is than its damage alone predicts.</w:t>
-      </w:r>
-    </w:p>
-    <w:tbl>
-      <w:tblPr>
-        <w:tblW w:type="dxa" w:w="9360"/>
-        <w:jc w:val="center"/>
-        <w:tblBorders>
-          <w:top w:val="single" w:color="auto" w:sz="4"/>
-          <w:left w:val="single" w:color="auto" w:sz="4"/>
-          <w:bottom w:val="single" w:color="auto" w:sz="4"/>
-          <w:right w:val="single" w:color="auto" w:sz="4"/>
-          <w:insideH w:val="single" w:color="auto" w:sz="4"/>
-          <w:insideV w:val="single" w:color="auto" w:sz="4"/>
-        </w:tblBorders>
-        <w:tblLayout w:type="fixed"/>
-      </w:tblPr>
-      <w:tblGrid>
-        <w:gridCol w:w="3200"/>
-        <w:gridCol w:w="2400"/>
-        <w:gridCol w:w="3760"/>
-      </w:tblGrid>
-      <w:tr>
-        <w:trPr>
-          <w:tblHeader/>
-        </w:trPr>
-        <w:tc>
-          <w:tcPr>
-            <w:tcW w:type="dxa" w:w="3200"/>
-            <w:tcBorders>
-              <w:top w:val="single" w:color="808080" w:sz="4"/>
-              <w:left w:val="single" w:color="808080" w:sz="4"/>
-              <w:bottom w:val="single" w:color="808080" w:sz="4"/>
-              <w:right w:val="single" w:color="808080" w:sz="4"/>
-            </w:tcBorders>
-            <w:shd w:fill="D5E8F0" w:color="auto" w:val="clear"/>
-            <w:tcMar>
-              <w:top w:type="dxa" w:w="120"/>
-              <w:left w:type="dxa" w:w="160"/>
-              <w:bottom w:type="dxa" w:w="120"/>
-              <w:right w:type="dxa" w:w="160"/>
-            </w:tcMar>
-          </w:tcPr>
-          <w:p>
-            <w:pPr>
-              <w:spacing w:after="0" w:line="260"/>
-              <w:jc w:val="left"/>
-            </w:pPr>
-            <w:r>
-              <w:rPr>
-                <w:b/>
-                <w:bCs/>
-              </w:rPr>
-              <w:t xml:space="preserve">Method</w:t>
-            </w:r>
-          </w:p>
-        </w:tc>
-        <w:tc>
-          <w:tcPr>
-            <w:tcW w:type="dxa" w:w="2400"/>
-            <w:tcBorders>
-              <w:top w:val="single" w:color="808080" w:sz="4"/>
-              <w:left w:val="single" w:color="808080" w:sz="4"/>
-              <w:bottom w:val="single" w:color="808080" w:sz="4"/>
-              <w:right w:val="single" w:color="808080" w:sz="4"/>
-            </w:tcBorders>
-            <w:shd w:fill="D5E8F0" w:color="auto" w:val="clear"/>
-            <w:tcMar>
-              <w:top w:type="dxa" w:w="120"/>
-              <w:left w:type="dxa" w:w="160"/>
-              <w:bottom w:type="dxa" w:w="120"/>
-              <w:right w:type="dxa" w:w="160"/>
-            </w:tcMar>
-          </w:tcPr>
-          <w:p>
-            <w:pPr>
-              <w:spacing w:after="0" w:line="260"/>
-              <w:jc w:val="left"/>
-            </w:pPr>
-            <w:r>
-              <w:rPr>
-                <w:b/>
-                <w:bCs/>
-              </w:rPr>
-              <w:t xml:space="preserve">Residual from fit</w:t>
-            </w:r>
-          </w:p>
-        </w:tc>
-        <w:tc>
-          <w:tcPr>
-            <w:tcW w:type="dxa" w:w="3760"/>
-            <w:tcBorders>
-              <w:top w:val="single" w:color="808080" w:sz="4"/>
-              <w:left w:val="single" w:color="808080" w:sz="4"/>
-              <w:bottom w:val="single" w:color="808080" w:sz="4"/>
-              <w:right w:val="single" w:color="808080" w:sz="4"/>
-            </w:tcBorders>
-            <w:shd w:fill="D5E8F0" w:color="auto" w:val="clear"/>
-            <w:tcMar>
-              <w:top w:type="dxa" w:w="120"/>
-              <w:left w:type="dxa" w:w="160"/>
-              <w:bottom w:type="dxa" w:w="120"/>
-              <w:right w:type="dxa" w:w="160"/>
-            </w:tcMar>
-          </w:tcPr>
-          <w:p>
-            <w:pPr>
-              <w:spacing w:after="0" w:line="260"/>
-              <w:jc w:val="left"/>
-            </w:pPr>
-            <w:r>
-              <w:rPr>
-                <w:b/>
-                <w:bCs/>
-              </w:rPr>
-              <w:t xml:space="preserve">Reading</w:t>
-            </w:r>
-          </w:p>
-        </w:tc>
-      </w:tr>
-      <w:tr>
-        <w:tc>
-          <w:tcPr>
-            <w:tcW w:type="dxa" w:w="3200"/>
-            <w:tcBorders>
-              <w:top w:val="single" w:color="808080" w:sz="4"/>
-              <w:left w:val="single" w:color="808080" w:sz="4"/>
-              <w:bottom w:val="single" w:color="808080" w:sz="4"/>
-              <w:right w:val="single" w:color="808080" w:sz="4"/>
-            </w:tcBorders>
-            <w:tcMar>
-              <w:top w:type="dxa" w:w="120"/>
-              <w:left w:type="dxa" w:w="160"/>
-              <w:bottom w:type="dxa" w:w="120"/>
-              <w:right w:type="dxa" w:w="160"/>
-            </w:tcMar>
-          </w:tcPr>
-          <w:p>
-            <w:pPr>
-              <w:spacing w:after="0" w:line="260"/>
-              <w:jc w:val="left"/>
-            </w:pPr>
-            <w:r>
-              <w:t xml:space="preserve">Full retrain</w:t>
-            </w:r>
-          </w:p>
-        </w:tc>
-        <w:tc>
-          <w:tcPr>
-            <w:tcW w:type="dxa" w:w="2400"/>
-            <w:tcBorders>
-              <w:top w:val="single" w:color="808080" w:sz="4"/>
-              <w:left w:val="single" w:color="808080" w:sz="4"/>
-              <w:bottom w:val="single" w:color="808080" w:sz="4"/>
-              <w:right w:val="single" w:color="808080" w:sz="4"/>
-            </w:tcBorders>
-            <w:tcMar>
-              <w:top w:type="dxa" w:w="120"/>
-              <w:left w:type="dxa" w:w="160"/>
-              <w:bottom w:type="dxa" w:w="120"/>
-              <w:right w:type="dxa" w:w="160"/>
-            </w:tcMar>
-          </w:tcPr>
-          <w:p>
-            <w:pPr>
-              <w:spacing w:after="0" w:line="260"/>
-              <w:jc w:val="left"/>
-            </w:pPr>
-            <w:r>
-              <w:t xml:space="preserve">-0.224</w:t>
-            </w:r>
-          </w:p>
-        </w:tc>
-        <w:tc>
-          <w:tcPr>
-            <w:tcW w:type="dxa" w:w="3760"/>
-            <w:tcBorders>
-              <w:top w:val="single" w:color="808080" w:sz="4"/>
-              <w:left w:val="single" w:color="808080" w:sz="4"/>
-              <w:bottom w:val="single" w:color="808080" w:sz="4"/>
-              <w:right w:val="single" w:color="808080" w:sz="4"/>
-            </w:tcBorders>
-            <w:tcMar>
-              <w:top w:type="dxa" w:w="120"/>
-              <w:left w:type="dxa" w:w="160"/>
-              <w:bottom w:type="dxa" w:w="120"/>
-              <w:right w:type="dxa" w:w="160"/>
-            </w:tcMar>
-          </w:tcPr>
-          <w:p>
-            <w:pPr>
-              <w:spacing w:after="0" w:line="260"/>
-              <w:jc w:val="left"/>
-            </w:pPr>
-            <w:r>
-              <w:t xml:space="preserve">Most durable for its damage</w:t>
-            </w:r>
-          </w:p>
-        </w:tc>
-      </w:tr>
-      <w:tr>
-        <w:tc>
-          <w:tcPr>
-            <w:tcW w:type="dxa" w:w="3200"/>
-            <w:tcBorders>
-              <w:top w:val="single" w:color="808080" w:sz="4"/>
-              <w:left w:val="single" w:color="808080" w:sz="4"/>
-              <w:bottom w:val="single" w:color="808080" w:sz="4"/>
-              <w:right w:val="single" w:color="808080" w:sz="4"/>
-            </w:tcBorders>
-            <w:tcMar>
-              <w:top w:type="dxa" w:w="120"/>
-              <w:left w:type="dxa" w:w="160"/>
-              <w:bottom w:type="dxa" w:w="120"/>
-              <w:right w:type="dxa" w:w="160"/>
-            </w:tcMar>
-          </w:tcPr>
-          <w:p>
-            <w:pPr>
-              <w:spacing w:after="0" w:line="260"/>
-              <w:jc w:val="left"/>
-            </w:pPr>
-            <w:r>
-              <w:t xml:space="preserve">HRU (unsharded)</w:t>
-            </w:r>
-          </w:p>
-        </w:tc>
-        <w:tc>
-          <w:tcPr>
-            <w:tcW w:type="dxa" w:w="2400"/>
-            <w:tcBorders>
-              <w:top w:val="single" w:color="808080" w:sz="4"/>
-              <w:left w:val="single" w:color="808080" w:sz="4"/>
-              <w:bottom w:val="single" w:color="808080" w:sz="4"/>
-              <w:right w:val="single" w:color="808080" w:sz="4"/>
-            </w:tcBorders>
-            <w:tcMar>
-              <w:top w:type="dxa" w:w="120"/>
-              <w:left w:type="dxa" w:w="160"/>
-              <w:bottom w:type="dxa" w:w="120"/>
-              <w:right w:type="dxa" w:w="160"/>
-            </w:tcMar>
-          </w:tcPr>
-          <w:p>
-            <w:pPr>
-              <w:spacing w:after="0" w:line="260"/>
-              <w:jc w:val="left"/>
-            </w:pPr>
-            <w:r>
-              <w:t xml:space="preserve">-0.203</w:t>
-            </w:r>
-          </w:p>
-        </w:tc>
-        <w:tc>
-          <w:tcPr>
-            <w:tcW w:type="dxa" w:w="3760"/>
-            <w:tcBorders>
-              <w:top w:val="single" w:color="808080" w:sz="4"/>
-              <w:left w:val="single" w:color="808080" w:sz="4"/>
-              <w:bottom w:val="single" w:color="808080" w:sz="4"/>
-              <w:right w:val="single" w:color="808080" w:sz="4"/>
-            </w:tcBorders>
-            <w:tcMar>
-              <w:top w:type="dxa" w:w="120"/>
-              <w:left w:type="dxa" w:w="160"/>
-              <w:bottom w:type="dxa" w:w="120"/>
-              <w:right w:type="dxa" w:w="160"/>
-            </w:tcMar>
-          </w:tcPr>
-          <w:p>
-            <w:pPr>
-              <w:spacing w:after="0" w:line="260"/>
-              <w:jc w:val="left"/>
-            </w:pPr>
-            <w:r>
-              <w:t xml:space="preserve">Second most durable for its damage</w:t>
-            </w:r>
-          </w:p>
-        </w:tc>
-      </w:tr>
-      <w:tr>
-        <w:tc>
-          <w:tcPr>
-            <w:tcW w:type="dxa" w:w="3200"/>
-            <w:tcBorders>
-              <w:top w:val="single" w:color="808080" w:sz="4"/>
-              <w:left w:val="single" w:color="808080" w:sz="4"/>
-              <w:bottom w:val="single" w:color="808080" w:sz="4"/>
-              <w:right w:val="single" w:color="808080" w:sz="4"/>
-            </w:tcBorders>
-            <w:tcMar>
-              <w:top w:type="dxa" w:w="120"/>
-              <w:left w:type="dxa" w:w="160"/>
-              <w:bottom w:type="dxa" w:w="120"/>
-              <w:right w:type="dxa" w:w="160"/>
-            </w:tcMar>
-          </w:tcPr>
-          <w:p>
-            <w:pPr>
-              <w:spacing w:after="0" w:line="260"/>
-              <w:jc w:val="left"/>
-            </w:pPr>
-            <w:r>
-              <w:t xml:space="preserve">Gradient ascent</w:t>
-            </w:r>
-          </w:p>
-        </w:tc>
-        <w:tc>
-          <w:tcPr>
-            <w:tcW w:type="dxa" w:w="2400"/>
-            <w:tcBorders>
-              <w:top w:val="single" w:color="808080" w:sz="4"/>
-              <w:left w:val="single" w:color="808080" w:sz="4"/>
-              <w:bottom w:val="single" w:color="808080" w:sz="4"/>
-              <w:right w:val="single" w:color="808080" w:sz="4"/>
-            </w:tcBorders>
-            <w:tcMar>
-              <w:top w:type="dxa" w:w="120"/>
-              <w:left w:type="dxa" w:w="160"/>
-              <w:bottom w:type="dxa" w:w="120"/>
-              <w:right w:type="dxa" w:w="160"/>
-            </w:tcMar>
-          </w:tcPr>
-          <w:p>
-            <w:pPr>
-              <w:spacing w:after="0" w:line="260"/>
-              <w:jc w:val="left"/>
-            </w:pPr>
-            <w:r>
-              <w:t xml:space="preserve">-0.122</w:t>
-            </w:r>
-          </w:p>
-        </w:tc>
-        <w:tc>
-          <w:tcPr>
-            <w:tcW w:type="dxa" w:w="3760"/>
-            <w:tcBorders>
-              <w:top w:val="single" w:color="808080" w:sz="4"/>
-              <w:left w:val="single" w:color="808080" w:sz="4"/>
-              <w:bottom w:val="single" w:color="808080" w:sz="4"/>
-              <w:right w:val="single" w:color="808080" w:sz="4"/>
-            </w:tcBorders>
-            <w:tcMar>
-              <w:top w:type="dxa" w:w="120"/>
-              <w:left w:type="dxa" w:w="160"/>
-              <w:bottom w:type="dxa" w:w="120"/>
-              <w:right w:type="dxa" w:w="160"/>
-            </w:tcMar>
-          </w:tcPr>
-          <w:p>
-            <w:pPr>
-              <w:spacing w:after="0" w:line="260"/>
-              <w:jc w:val="left"/>
-            </w:pPr>
-            <w:r>
-              <w:t xml:space="preserve">Above the trend</w:t>
-            </w:r>
-          </w:p>
-        </w:tc>
-      </w:tr>
-      <w:tr>
-        <w:tc>
-          <w:tcPr>
-            <w:tcW w:type="dxa" w:w="3200"/>
-            <w:tcBorders>
-              <w:top w:val="single" w:color="808080" w:sz="4"/>
-              <w:left w:val="single" w:color="808080" w:sz="4"/>
-              <w:bottom w:val="single" w:color="808080" w:sz="4"/>
-              <w:right w:val="single" w:color="808080" w:sz="4"/>
-            </w:tcBorders>
-            <w:tcMar>
-              <w:top w:type="dxa" w:w="120"/>
-              <w:left w:type="dxa" w:w="160"/>
-              <w:bottom w:type="dxa" w:w="120"/>
-              <w:right w:type="dxa" w:w="160"/>
-            </w:tcMar>
-          </w:tcPr>
-          <w:p>
-            <w:pPr>
-              <w:spacing w:after="0" w:line="260"/>
-              <w:jc w:val="left"/>
-            </w:pPr>
-            <w:r>
-              <w:t xml:space="preserve">HRU, k = 8</w:t>
-            </w:r>
-          </w:p>
-        </w:tc>
-        <w:tc>
-          <w:tcPr>
-            <w:tcW w:type="dxa" w:w="2400"/>
-            <w:tcBorders>
-              <w:top w:val="single" w:color="808080" w:sz="4"/>
-              <w:left w:val="single" w:color="808080" w:sz="4"/>
-              <w:bottom w:val="single" w:color="808080" w:sz="4"/>
-              <w:right w:val="single" w:color="808080" w:sz="4"/>
-            </w:tcBorders>
-            <w:tcMar>
-              <w:top w:type="dxa" w:w="120"/>
-              <w:left w:type="dxa" w:w="160"/>
-              <w:bottom w:type="dxa" w:w="120"/>
-              <w:right w:type="dxa" w:w="160"/>
-            </w:tcMar>
-          </w:tcPr>
-          <w:p>
-            <w:pPr>
-              <w:spacing w:after="0" w:line="260"/>
-              <w:jc w:val="left"/>
-            </w:pPr>
-            <w:r>
-              <w:t xml:space="preserve">-0.077</w:t>
-            </w:r>
-          </w:p>
-        </w:tc>
-        <w:tc>
-          <w:tcPr>
-            <w:tcW w:type="dxa" w:w="3760"/>
-            <w:tcBorders>
-              <w:top w:val="single" w:color="808080" w:sz="4"/>
-              <w:left w:val="single" w:color="808080" w:sz="4"/>
-              <w:bottom w:val="single" w:color="808080" w:sz="4"/>
-              <w:right w:val="single" w:color="808080" w:sz="4"/>
-            </w:tcBorders>
-            <w:tcMar>
-              <w:top w:type="dxa" w:w="120"/>
-              <w:left w:type="dxa" w:w="160"/>
-              <w:bottom w:type="dxa" w:w="120"/>
-              <w:right w:type="dxa" w:w="160"/>
-            </w:tcMar>
-          </w:tcPr>
-          <w:p>
-            <w:pPr>
-              <w:spacing w:after="0" w:line="260"/>
-              <w:jc w:val="left"/>
-            </w:pPr>
-            <w:r>
-              <w:t xml:space="preserve">Slightly above the trend</w:t>
-            </w:r>
-          </w:p>
-        </w:tc>
-      </w:tr>
-      <w:tr>
-        <w:tc>
-          <w:tcPr>
-            <w:tcW w:type="dxa" w:w="3200"/>
-            <w:tcBorders>
-              <w:top w:val="single" w:color="808080" w:sz="4"/>
-              <w:left w:val="single" w:color="808080" w:sz="4"/>
-              <w:bottom w:val="single" w:color="808080" w:sz="4"/>
-              <w:right w:val="single" w:color="808080" w:sz="4"/>
-            </w:tcBorders>
-            <w:tcMar>
-              <w:top w:type="dxa" w:w="120"/>
-              <w:left w:type="dxa" w:w="160"/>
-              <w:bottom w:type="dxa" w:w="120"/>
-              <w:right w:type="dxa" w:w="160"/>
-            </w:tcMar>
-          </w:tcPr>
-          <w:p>
-            <w:pPr>
-              <w:spacing w:after="0" w:line="260"/>
-              <w:jc w:val="left"/>
-            </w:pPr>
-            <w:r>
-              <w:t xml:space="preserve">RMU</w:t>
-            </w:r>
-          </w:p>
-        </w:tc>
-        <w:tc>
-          <w:tcPr>
-            <w:tcW w:type="dxa" w:w="2400"/>
-            <w:tcBorders>
-              <w:top w:val="single" w:color="808080" w:sz="4"/>
-              <w:left w:val="single" w:color="808080" w:sz="4"/>
-              <w:bottom w:val="single" w:color="808080" w:sz="4"/>
-              <w:right w:val="single" w:color="808080" w:sz="4"/>
-            </w:tcBorders>
-            <w:tcMar>
-              <w:top w:type="dxa" w:w="120"/>
-              <w:left w:type="dxa" w:w="160"/>
-              <w:bottom w:type="dxa" w:w="120"/>
-              <w:right w:type="dxa" w:w="160"/>
-            </w:tcMar>
-          </w:tcPr>
-          <w:p>
-            <w:pPr>
-              <w:spacing w:after="0" w:line="260"/>
-              <w:jc w:val="left"/>
-            </w:pPr>
-            <w:r>
-              <w:t xml:space="preserve">+0.084</w:t>
-            </w:r>
-          </w:p>
-        </w:tc>
-        <w:tc>
-          <w:tcPr>
-            <w:tcW w:type="dxa" w:w="3760"/>
-            <w:tcBorders>
-              <w:top w:val="single" w:color="808080" w:sz="4"/>
-              <w:left w:val="single" w:color="808080" w:sz="4"/>
-              <w:bottom w:val="single" w:color="808080" w:sz="4"/>
-              <w:right w:val="single" w:color="808080" w:sz="4"/>
-            </w:tcBorders>
-            <w:tcMar>
-              <w:top w:type="dxa" w:w="120"/>
-              <w:left w:type="dxa" w:w="160"/>
-              <w:bottom w:type="dxa" w:w="120"/>
-              <w:right w:type="dxa" w:w="160"/>
-            </w:tcMar>
-          </w:tcPr>
-          <w:p>
-            <w:pPr>
-              <w:spacing w:after="0" w:line="260"/>
-              <w:jc w:val="left"/>
-            </w:pPr>
-            <w:r>
-              <w:t xml:space="preserve">Below the trend</w:t>
-            </w:r>
-          </w:p>
-        </w:tc>
-      </w:tr>
-      <w:tr>
-        <w:tc>
-          <w:tcPr>
-            <w:tcW w:type="dxa" w:w="3200"/>
-            <w:tcBorders>
-              <w:top w:val="single" w:color="808080" w:sz="4"/>
-              <w:left w:val="single" w:color="808080" w:sz="4"/>
-              <w:bottom w:val="single" w:color="808080" w:sz="4"/>
-              <w:right w:val="single" w:color="808080" w:sz="4"/>
-            </w:tcBorders>
-            <w:tcMar>
-              <w:top w:type="dxa" w:w="120"/>
-              <w:left w:type="dxa" w:w="160"/>
-              <w:bottom w:type="dxa" w:w="120"/>
-              <w:right w:type="dxa" w:w="160"/>
-            </w:tcMar>
-          </w:tcPr>
-          <w:p>
-            <w:pPr>
-              <w:spacing w:after="0" w:line="260"/>
-              <w:jc w:val="left"/>
-            </w:pPr>
-            <w:r>
-              <w:t xml:space="preserve">NPO</w:t>
-            </w:r>
-          </w:p>
-        </w:tc>
-        <w:tc>
-          <w:tcPr>
-            <w:tcW w:type="dxa" w:w="2400"/>
-            <w:tcBorders>
-              <w:top w:val="single" w:color="808080" w:sz="4"/>
-              <w:left w:val="single" w:color="808080" w:sz="4"/>
-              <w:bottom w:val="single" w:color="808080" w:sz="4"/>
-              <w:right w:val="single" w:color="808080" w:sz="4"/>
-            </w:tcBorders>
-            <w:tcMar>
-              <w:top w:type="dxa" w:w="120"/>
-              <w:left w:type="dxa" w:w="160"/>
-              <w:bottom w:type="dxa" w:w="120"/>
-              <w:right w:type="dxa" w:w="160"/>
-            </w:tcMar>
-          </w:tcPr>
-          <w:p>
-            <w:pPr>
-              <w:spacing w:after="0" w:line="260"/>
-              <w:jc w:val="left"/>
-            </w:pPr>
-            <w:r>
-              <w:t xml:space="preserve">+0.293</w:t>
-            </w:r>
-          </w:p>
-        </w:tc>
-        <w:tc>
-          <w:tcPr>
-            <w:tcW w:type="dxa" w:w="3760"/>
-            <w:tcBorders>
-              <w:top w:val="single" w:color="808080" w:sz="4"/>
-              <w:left w:val="single" w:color="808080" w:sz="4"/>
-              <w:bottom w:val="single" w:color="808080" w:sz="4"/>
-              <w:right w:val="single" w:color="808080" w:sz="4"/>
-            </w:tcBorders>
-            <w:tcMar>
-              <w:top w:type="dxa" w:w="120"/>
-              <w:left w:type="dxa" w:w="160"/>
-              <w:bottom w:type="dxa" w:w="120"/>
-              <w:right w:type="dxa" w:w="160"/>
-            </w:tcMar>
-          </w:tcPr>
-          <w:p>
-            <w:pPr>
-              <w:spacing w:after="0" w:line="260"/>
-              <w:jc w:val="left"/>
-            </w:pPr>
-            <w:r>
-              <w:t xml:space="preserve">Least durable for its damage</w:t>
-            </w:r>
-          </w:p>
-        </w:tc>
-      </w:tr>
-    </w:tbl>
-    <w:p>
-      <w:pPr>
-        <w:spacing w:after="240" w:before="80"/>
-        <w:jc w:val="center"/>
-      </w:pPr>
-      <w:r>
-        <w:rPr>
-          <w:i/>
-          <w:iCs/>
-          <w:sz w:val="22"/>
-          <w:szCs w:val="22"/>
-        </w:rPr>
-        <w:t xml:space="preserve">Table 4.3: Durability Adjusted for Model Damage</w:t>
+        <w:t xml:space="preserve">Gradient ascent and NPO also enter the zone, at one third of HRU's cost, but with truth ratios of 1.67 and 13.17: they reach it by over-forgetting, so that the model prefers wrong answers, whereas HRU's truth ratio of 1.29 stays close to the 1.01 of a retrained model. Sharded HRU, SISA and RMU fall below the zone. HRU's position comes with the retain-set cost discussed above, and its multi-seed confirmation is the purpose of the validation phase (Section 5.3).</w:t>
+      </w:r>
+    </w:p>
+    <w:p>
+      <w:pPr>
+        <w:pStyle w:val="Heading2"/>
+        <w:keepNext/>
+      </w:pPr>
+      <w:r>
+        <w:t xml:space="preserve">4.4 Validity of the Durability Metric</w:t>
       </w:r>
     </w:p>
     <w:p>
@@ -8319,487 +8842,7 @@
         <w:jc w:val="both"/>
       </w:pPr>
       <w:r>
-        <w:t xml:space="preserve">After adjustment, HRU remains second only to full retraining, while NPO is the weakest. HRU's lead therefore reflects more than damage, but the size of its true advantage can only be established with a fact-level metric, which has been implemented for the validation phase.</w:t>
-      </w:r>
-    </w:p>
-    <w:p>
-      <w:pPr>
-        <w:pStyle w:val="Heading2"/>
-        <w:keepNext/>
-      </w:pPr>
-      <w:r>
-        <w:t xml:space="preserve">4.5 Cost Analysis</w:t>
-      </w:r>
-    </w:p>
-    <w:tbl>
-      <w:tblPr>
-        <w:tblW w:type="dxa" w:w="9360"/>
-        <w:jc w:val="center"/>
-        <w:tblBorders>
-          <w:top w:val="single" w:color="auto" w:sz="4"/>
-          <w:left w:val="single" w:color="auto" w:sz="4"/>
-          <w:bottom w:val="single" w:color="auto" w:sz="4"/>
-          <w:right w:val="single" w:color="auto" w:sz="4"/>
-          <w:insideH w:val="single" w:color="auto" w:sz="4"/>
-          <w:insideV w:val="single" w:color="auto" w:sz="4"/>
-        </w:tblBorders>
-        <w:tblLayout w:type="fixed"/>
-      </w:tblPr>
-      <w:tblGrid>
-        <w:gridCol w:w="3800"/>
-        <w:gridCol w:w="2700"/>
-        <w:gridCol w:w="2860"/>
-      </w:tblGrid>
-      <w:tr>
-        <w:trPr>
-          <w:tblHeader/>
-        </w:trPr>
-        <w:tc>
-          <w:tcPr>
-            <w:tcW w:type="dxa" w:w="3800"/>
-            <w:tcBorders>
-              <w:top w:val="single" w:color="808080" w:sz="4"/>
-              <w:left w:val="single" w:color="808080" w:sz="4"/>
-              <w:bottom w:val="single" w:color="808080" w:sz="4"/>
-              <w:right w:val="single" w:color="808080" w:sz="4"/>
-            </w:tcBorders>
-            <w:shd w:fill="D5E8F0" w:color="auto" w:val="clear"/>
-            <w:tcMar>
-              <w:top w:type="dxa" w:w="120"/>
-              <w:left w:type="dxa" w:w="160"/>
-              <w:bottom w:type="dxa" w:w="120"/>
-              <w:right w:type="dxa" w:w="160"/>
-            </w:tcMar>
-          </w:tcPr>
-          <w:p>
-            <w:pPr>
-              <w:spacing w:after="0" w:line="260"/>
-              <w:jc w:val="left"/>
-            </w:pPr>
-            <w:r>
-              <w:rPr>
-                <w:b/>
-                <w:bCs/>
-              </w:rPr>
-              <w:t xml:space="preserve">Method</w:t>
-            </w:r>
-          </w:p>
-        </w:tc>
-        <w:tc>
-          <w:tcPr>
-            <w:tcW w:type="dxa" w:w="2700"/>
-            <w:tcBorders>
-              <w:top w:val="single" w:color="808080" w:sz="4"/>
-              <w:left w:val="single" w:color="808080" w:sz="4"/>
-              <w:bottom w:val="single" w:color="808080" w:sz="4"/>
-              <w:right w:val="single" w:color="808080" w:sz="4"/>
-            </w:tcBorders>
-            <w:shd w:fill="D5E8F0" w:color="auto" w:val="clear"/>
-            <w:tcMar>
-              <w:top w:type="dxa" w:w="120"/>
-              <w:left w:type="dxa" w:w="160"/>
-              <w:bottom w:type="dxa" w:w="120"/>
-              <w:right w:type="dxa" w:w="160"/>
-            </w:tcMar>
-          </w:tcPr>
-          <w:p>
-            <w:pPr>
-              <w:spacing w:after="0" w:line="260"/>
-              <w:jc w:val="left"/>
-            </w:pPr>
-            <w:r>
-              <w:rPr>
-                <w:b/>
-                <w:bCs/>
-              </w:rPr>
-              <w:t xml:space="preserve">Updates per request</w:t>
-            </w:r>
-          </w:p>
-        </w:tc>
-        <w:tc>
-          <w:tcPr>
-            <w:tcW w:type="dxa" w:w="2860"/>
-            <w:tcBorders>
-              <w:top w:val="single" w:color="808080" w:sz="4"/>
-              <w:left w:val="single" w:color="808080" w:sz="4"/>
-              <w:bottom w:val="single" w:color="808080" w:sz="4"/>
-              <w:right w:val="single" w:color="808080" w:sz="4"/>
-            </w:tcBorders>
-            <w:shd w:fill="D5E8F0" w:color="auto" w:val="clear"/>
-            <w:tcMar>
-              <w:top w:type="dxa" w:w="120"/>
-              <w:left w:type="dxa" w:w="160"/>
-              <w:bottom w:type="dxa" w:w="120"/>
-              <w:right w:type="dxa" w:w="160"/>
-            </w:tcMar>
-          </w:tcPr>
-          <w:p>
-            <w:pPr>
-              <w:spacing w:after="0" w:line="260"/>
-              <w:jc w:val="left"/>
-            </w:pPr>
-            <w:r>
-              <w:rPr>
-                <w:b/>
-                <w:bCs/>
-              </w:rPr>
-              <w:t xml:space="preserve">Relative to one NPO pass</w:t>
-            </w:r>
-          </w:p>
-        </w:tc>
-      </w:tr>
-      <w:tr>
-        <w:tc>
-          <w:tcPr>
-            <w:tcW w:type="dxa" w:w="3800"/>
-            <w:tcBorders>
-              <w:top w:val="single" w:color="808080" w:sz="4"/>
-              <w:left w:val="single" w:color="808080" w:sz="4"/>
-              <w:bottom w:val="single" w:color="808080" w:sz="4"/>
-              <w:right w:val="single" w:color="808080" w:sz="4"/>
-            </w:tcBorders>
-            <w:tcMar>
-              <w:top w:type="dxa" w:w="120"/>
-              <w:left w:type="dxa" w:w="160"/>
-              <w:bottom w:type="dxa" w:w="120"/>
-              <w:right w:type="dxa" w:w="160"/>
-            </w:tcMar>
-          </w:tcPr>
-          <w:p>
-            <w:pPr>
-              <w:spacing w:after="0" w:line="260"/>
-              <w:jc w:val="left"/>
-            </w:pPr>
-            <w:r>
-              <w:t xml:space="preserve">SISA (shard 0 only)</w:t>
-            </w:r>
-          </w:p>
-        </w:tc>
-        <w:tc>
-          <w:tcPr>
-            <w:tcW w:type="dxa" w:w="2700"/>
-            <w:tcBorders>
-              <w:top w:val="single" w:color="808080" w:sz="4"/>
-              <w:left w:val="single" w:color="808080" w:sz="4"/>
-              <w:bottom w:val="single" w:color="808080" w:sz="4"/>
-              <w:right w:val="single" w:color="808080" w:sz="4"/>
-            </w:tcBorders>
-            <w:tcMar>
-              <w:top w:type="dxa" w:w="120"/>
-              <w:left w:type="dxa" w:w="160"/>
-              <w:bottom w:type="dxa" w:w="120"/>
-              <w:right w:type="dxa" w:w="160"/>
-            </w:tcMar>
-          </w:tcPr>
-          <w:p>
-            <w:pPr>
-              <w:spacing w:after="0" w:line="260"/>
-              <w:jc w:val="left"/>
-            </w:pPr>
-            <w:r>
-              <w:t xml:space="preserve">26</w:t>
-            </w:r>
-          </w:p>
-        </w:tc>
-        <w:tc>
-          <w:tcPr>
-            <w:tcW w:type="dxa" w:w="2860"/>
-            <w:tcBorders>
-              <w:top w:val="single" w:color="808080" w:sz="4"/>
-              <w:left w:val="single" w:color="808080" w:sz="4"/>
-              <w:bottom w:val="single" w:color="808080" w:sz="4"/>
-              <w:right w:val="single" w:color="808080" w:sz="4"/>
-            </w:tcBorders>
-            <w:tcMar>
-              <w:top w:type="dxa" w:w="120"/>
-              <w:left w:type="dxa" w:w="160"/>
-              <w:bottom w:type="dxa" w:w="120"/>
-              <w:right w:type="dxa" w:w="160"/>
-            </w:tcMar>
-          </w:tcPr>
-          <w:p>
-            <w:pPr>
-              <w:spacing w:after="0" w:line="260"/>
-              <w:jc w:val="left"/>
-            </w:pPr>
-            <w:r>
-              <w:t xml:space="preserve">0.65×</w:t>
-            </w:r>
-          </w:p>
-        </w:tc>
-      </w:tr>
-      <w:tr>
-        <w:tc>
-          <w:tcPr>
-            <w:tcW w:type="dxa" w:w="3800"/>
-            <w:tcBorders>
-              <w:top w:val="single" w:color="808080" w:sz="4"/>
-              <w:left w:val="single" w:color="808080" w:sz="4"/>
-              <w:bottom w:val="single" w:color="808080" w:sz="4"/>
-              <w:right w:val="single" w:color="808080" w:sz="4"/>
-            </w:tcBorders>
-            <w:tcMar>
-              <w:top w:type="dxa" w:w="120"/>
-              <w:left w:type="dxa" w:w="160"/>
-              <w:bottom w:type="dxa" w:w="120"/>
-              <w:right w:type="dxa" w:w="160"/>
-            </w:tcMar>
-          </w:tcPr>
-          <w:p>
-            <w:pPr>
-              <w:spacing w:after="0" w:line="260"/>
-              <w:jc w:val="left"/>
-            </w:pPr>
-            <w:r>
-              <w:t xml:space="preserve">Gradient ascent, NPO, RMU</w:t>
-            </w:r>
-          </w:p>
-        </w:tc>
-        <w:tc>
-          <w:tcPr>
-            <w:tcW w:type="dxa" w:w="2700"/>
-            <w:tcBorders>
-              <w:top w:val="single" w:color="808080" w:sz="4"/>
-              <w:left w:val="single" w:color="808080" w:sz="4"/>
-              <w:bottom w:val="single" w:color="808080" w:sz="4"/>
-              <w:right w:val="single" w:color="808080" w:sz="4"/>
-            </w:tcBorders>
-            <w:tcMar>
-              <w:top w:type="dxa" w:w="120"/>
-              <w:left w:type="dxa" w:w="160"/>
-              <w:bottom w:type="dxa" w:w="120"/>
-              <w:right w:type="dxa" w:w="160"/>
-            </w:tcMar>
-          </w:tcPr>
-          <w:p>
-            <w:pPr>
-              <w:spacing w:after="0" w:line="260"/>
-              <w:jc w:val="left"/>
-            </w:pPr>
-            <w:r>
-              <w:t xml:space="preserve">40</w:t>
-            </w:r>
-          </w:p>
-        </w:tc>
-        <w:tc>
-          <w:tcPr>
-            <w:tcW w:type="dxa" w:w="2860"/>
-            <w:tcBorders>
-              <w:top w:val="single" w:color="808080" w:sz="4"/>
-              <w:left w:val="single" w:color="808080" w:sz="4"/>
-              <w:bottom w:val="single" w:color="808080" w:sz="4"/>
-              <w:right w:val="single" w:color="808080" w:sz="4"/>
-            </w:tcBorders>
-            <w:tcMar>
-              <w:top w:type="dxa" w:w="120"/>
-              <w:left w:type="dxa" w:w="160"/>
-              <w:bottom w:type="dxa" w:w="120"/>
-              <w:right w:type="dxa" w:w="160"/>
-            </w:tcMar>
-          </w:tcPr>
-          <w:p>
-            <w:pPr>
-              <w:spacing w:after="0" w:line="260"/>
-              <w:jc w:val="left"/>
-            </w:pPr>
-            <w:r>
-              <w:t xml:space="preserve">1.0×</w:t>
-            </w:r>
-          </w:p>
-        </w:tc>
-      </w:tr>
-      <w:tr>
-        <w:tc>
-          <w:tcPr>
-            <w:tcW w:type="dxa" w:w="3800"/>
-            <w:tcBorders>
-              <w:top w:val="single" w:color="808080" w:sz="4"/>
-              <w:left w:val="single" w:color="808080" w:sz="4"/>
-              <w:bottom w:val="single" w:color="808080" w:sz="4"/>
-              <w:right w:val="single" w:color="808080" w:sz="4"/>
-            </w:tcBorders>
-            <w:tcMar>
-              <w:top w:type="dxa" w:w="120"/>
-              <w:left w:type="dxa" w:w="160"/>
-              <w:bottom w:type="dxa" w:w="120"/>
-              <w:right w:type="dxa" w:w="160"/>
-            </w:tcMar>
-          </w:tcPr>
-          <w:p>
-            <w:pPr>
-              <w:spacing w:after="0" w:line="260"/>
-              <w:jc w:val="left"/>
-            </w:pPr>
-            <w:r>
-              <w:t xml:space="preserve">HRU (scrub updates)</w:t>
-            </w:r>
-          </w:p>
-        </w:tc>
-        <w:tc>
-          <w:tcPr>
-            <w:tcW w:type="dxa" w:w="2700"/>
-            <w:tcBorders>
-              <w:top w:val="single" w:color="808080" w:sz="4"/>
-              <w:left w:val="single" w:color="808080" w:sz="4"/>
-              <w:bottom w:val="single" w:color="808080" w:sz="4"/>
-              <w:right w:val="single" w:color="808080" w:sz="4"/>
-            </w:tcBorders>
-            <w:tcMar>
-              <w:top w:type="dxa" w:w="120"/>
-              <w:left w:type="dxa" w:w="160"/>
-              <w:bottom w:type="dxa" w:w="120"/>
-              <w:right w:type="dxa" w:w="160"/>
-            </w:tcMar>
-          </w:tcPr>
-          <w:p>
-            <w:pPr>
-              <w:spacing w:after="0" w:line="260"/>
-              <w:jc w:val="left"/>
-            </w:pPr>
-            <w:r>
-              <w:t xml:space="preserve">120</w:t>
-            </w:r>
-          </w:p>
-        </w:tc>
-        <w:tc>
-          <w:tcPr>
-            <w:tcW w:type="dxa" w:w="2860"/>
-            <w:tcBorders>
-              <w:top w:val="single" w:color="808080" w:sz="4"/>
-              <w:left w:val="single" w:color="808080" w:sz="4"/>
-              <w:bottom w:val="single" w:color="808080" w:sz="4"/>
-              <w:right w:val="single" w:color="808080" w:sz="4"/>
-            </w:tcBorders>
-            <w:tcMar>
-              <w:top w:type="dxa" w:w="120"/>
-              <w:left w:type="dxa" w:w="160"/>
-              <w:bottom w:type="dxa" w:w="120"/>
-              <w:right w:type="dxa" w:w="160"/>
-            </w:tcMar>
-          </w:tcPr>
-          <w:p>
-            <w:pPr>
-              <w:spacing w:after="0" w:line="260"/>
-              <w:jc w:val="left"/>
-            </w:pPr>
-            <w:r>
-              <w:t xml:space="preserve">3.0×</w:t>
-            </w:r>
-          </w:p>
-        </w:tc>
-      </w:tr>
-      <w:tr>
-        <w:tc>
-          <w:tcPr>
-            <w:tcW w:type="dxa" w:w="3800"/>
-            <w:tcBorders>
-              <w:top w:val="single" w:color="808080" w:sz="4"/>
-              <w:left w:val="single" w:color="808080" w:sz="4"/>
-              <w:bottom w:val="single" w:color="808080" w:sz="4"/>
-              <w:right w:val="single" w:color="808080" w:sz="4"/>
-            </w:tcBorders>
-            <w:tcMar>
-              <w:top w:type="dxa" w:w="120"/>
-              <w:left w:type="dxa" w:w="160"/>
-              <w:bottom w:type="dxa" w:w="120"/>
-              <w:right w:type="dxa" w:w="160"/>
-            </w:tcMar>
-          </w:tcPr>
-          <w:p>
-            <w:pPr>
-              <w:spacing w:after="0" w:line="260"/>
-              <w:jc w:val="left"/>
-            </w:pPr>
-            <w:r>
-              <w:t xml:space="preserve">Full retrain</w:t>
-            </w:r>
-          </w:p>
-        </w:tc>
-        <w:tc>
-          <w:tcPr>
-            <w:tcW w:type="dxa" w:w="2700"/>
-            <w:tcBorders>
-              <w:top w:val="single" w:color="808080" w:sz="4"/>
-              <w:left w:val="single" w:color="808080" w:sz="4"/>
-              <w:bottom w:val="single" w:color="808080" w:sz="4"/>
-              <w:right w:val="single" w:color="808080" w:sz="4"/>
-            </w:tcBorders>
-            <w:tcMar>
-              <w:top w:type="dxa" w:w="120"/>
-              <w:left w:type="dxa" w:w="160"/>
-              <w:bottom w:type="dxa" w:w="120"/>
-              <w:right w:type="dxa" w:w="160"/>
-            </w:tcMar>
-          </w:tcPr>
-          <w:p>
-            <w:pPr>
-              <w:spacing w:after="0" w:line="260"/>
-              <w:jc w:val="left"/>
-            </w:pPr>
-            <w:r>
-              <w:t xml:space="preserve">150</w:t>
-            </w:r>
-          </w:p>
-        </w:tc>
-        <w:tc>
-          <w:tcPr>
-            <w:tcW w:type="dxa" w:w="2860"/>
-            <w:tcBorders>
-              <w:top w:val="single" w:color="808080" w:sz="4"/>
-              <w:left w:val="single" w:color="808080" w:sz="4"/>
-              <w:bottom w:val="single" w:color="808080" w:sz="4"/>
-              <w:right w:val="single" w:color="808080" w:sz="4"/>
-            </w:tcBorders>
-            <w:tcMar>
-              <w:top w:type="dxa" w:w="120"/>
-              <w:left w:type="dxa" w:w="160"/>
-              <w:bottom w:type="dxa" w:w="120"/>
-              <w:right w:type="dxa" w:w="160"/>
-            </w:tcMar>
-          </w:tcPr>
-          <w:p>
-            <w:pPr>
-              <w:spacing w:after="0" w:line="260"/>
-              <w:jc w:val="left"/>
-            </w:pPr>
-            <w:r>
-              <w:t xml:space="preserve">3.75×</w:t>
-            </w:r>
-          </w:p>
-        </w:tc>
-      </w:tr>
-    </w:tbl>
-    <w:p>
-      <w:pPr>
-        <w:spacing w:after="240" w:before="80"/>
-        <w:jc w:val="center"/>
-      </w:pPr>
-      <w:r>
-        <w:rPr>
-          <w:i/>
-          <w:iCs/>
-          <w:sz w:val="22"/>
-          <w:szCs w:val="22"/>
-        </w:rPr>
-        <w:t xml:space="preserve">Table 4.4: Cost per Deletion Request</w:t>
-      </w:r>
-    </w:p>
-    <w:p>
-      <w:pPr>
-        <w:spacing w:after="120" w:before="0" w:line="360"/>
-        <w:jc w:val="both"/>
-      </w:pPr>
-      <w:r>
-        <w:t xml:space="preserve">HRU used 120 optimizer updates per request, 3.0 times one NPO pass and within the 2-5× design target. Each SAM update requires two forward-backward passes, and the attack probes add further passes on model copies, so wall-clock cost is higher than the update count suggests. At this scale full retraining is unusually cheap because the corpus has only 400 retain examples; in deployment its cost grows with the whole training corpus, while HRU's grows only with the data being forgotten. SISA's one-time cost of training its shards is excluded, as it is amortised over all future requests.</w:t>
-      </w:r>
-    </w:p>
-    <w:p>
-      <w:pPr>
-        <w:spacing w:after="120" w:before="0" w:line="360"/>
-        <w:jc w:val="both"/>
-      </w:pPr>
-      <w:r>
-        <w:t xml:space="preserve">Figure 4.4 places every method on cost and durability together. The shaded target zone marks the region the project aims for: durability between -0.60 and -1.56, that is, at least as durable as full retraining (-0.582), at a cost below full retraining (150 updates). Unsharded HRU lies inside the zone and is the most durable method in it, at -1.309 with 120 updates, 80% of the cost of retraining.</w:t>
+        <w:t xml:space="preserve">Because the most durable methods were also the most damaging, we tested whether the durability metric simply rewards damage. Across all twelve variants, durability correlates with retain-set degradation at r = +0.88 (Figure 4.4).</w:t>
       </w:r>
     </w:p>
     <w:p>
@@ -8811,7 +8854,7 @@
       <w:r>
         <w:drawing>
           <wp:inline distT="0" distB="0" distL="0" distR="0">
-            <wp:extent cx="5334000" cy="3448050"/>
+            <wp:extent cx="5334000" cy="3286125"/>
             <wp:effectExtent t="0" r="0" b="0" l="0"/>
             <wp:docPr id="7" name="" descr="" title=""/>
             <wp:cNvGraphicFramePr>
@@ -8836,7 +8879,7 @@
                   <pic:spPr bwMode="auto">
                     <a:xfrm>
                       <a:off x="0" y="0"/>
-                      <a:ext cx="5334000" cy="3448050"/>
+                      <a:ext cx="5334000" cy="3286125"/>
                     </a:xfrm>
                     <a:prstGeom prst="rect">
                       <a:avLst/>
@@ -8861,7 +8904,7 @@
           <w:sz w:val="22"/>
           <w:szCs w:val="22"/>
         </w:rPr>
-        <w:t xml:space="preserve">Figure 4.4: Cost-Durability Target Zone</w:t>
+        <w:t xml:space="preserve">Figure 4.4: Durability Versus Model Damage</w:t>
       </w:r>
     </w:p>
     <w:p>
@@ -8870,7 +8913,1109 @@
         <w:jc w:val="both"/>
       </w:pPr>
       <w:r>
-        <w:t xml:space="preserve">Gradient ascent and NPO also enter the zone, at one third of HRU's cost, but with truth ratios of 1.67 and 13.17: they reach it by over-forgetting, so that the model prefers wrong answers, whereas HRU's truth ratio of 1.29 stays close to the 1.01 of a retrained model. Sharded HRU, SISA and RMU fall below the zone. HRU's position comes with the retain-set cost discussed in Section 4.3, and its multi-seed confirmation is the purpose of the validation phase (Section 5.3).</w:t>
+        <w:t xml:space="preserve">The cause is that the metric averages the log-probability of the whole answer sentence, of which only one or two tokens are the fact; a method that suppresses the answer template as a whole scores well. To separate the two effects, Table 4.3 reports each method's residual from the least-squares fit: how much more (negative) or less (positive) durable it is than its damage alone predicts.</w:t>
+      </w:r>
+    </w:p>
+    <w:tbl>
+      <w:tblPr>
+        <w:tblW w:type="dxa" w:w="9360"/>
+        <w:jc w:val="center"/>
+        <w:tblBorders>
+          <w:top w:val="single" w:color="auto" w:sz="4"/>
+          <w:left w:val="single" w:color="auto" w:sz="4"/>
+          <w:bottom w:val="single" w:color="auto" w:sz="4"/>
+          <w:right w:val="single" w:color="auto" w:sz="4"/>
+          <w:insideH w:val="single" w:color="auto" w:sz="4"/>
+          <w:insideV w:val="single" w:color="auto" w:sz="4"/>
+        </w:tblBorders>
+        <w:tblLayout w:type="fixed"/>
+      </w:tblPr>
+      <w:tblGrid>
+        <w:gridCol w:w="3200"/>
+        <w:gridCol w:w="2400"/>
+        <w:gridCol w:w="3760"/>
+      </w:tblGrid>
+      <w:tr>
+        <w:trPr>
+          <w:tblHeader/>
+        </w:trPr>
+        <w:tc>
+          <w:tcPr>
+            <w:tcW w:type="dxa" w:w="3200"/>
+            <w:tcBorders>
+              <w:top w:val="single" w:color="808080" w:sz="4"/>
+              <w:left w:val="single" w:color="808080" w:sz="4"/>
+              <w:bottom w:val="single" w:color="808080" w:sz="4"/>
+              <w:right w:val="single" w:color="808080" w:sz="4"/>
+            </w:tcBorders>
+            <w:shd w:fill="D5E8F0" w:color="auto" w:val="clear"/>
+            <w:tcMar>
+              <w:top w:type="dxa" w:w="120"/>
+              <w:left w:type="dxa" w:w="160"/>
+              <w:bottom w:type="dxa" w:w="120"/>
+              <w:right w:type="dxa" w:w="160"/>
+            </w:tcMar>
+          </w:tcPr>
+          <w:p>
+            <w:pPr>
+              <w:spacing w:after="0" w:line="260"/>
+              <w:jc w:val="left"/>
+            </w:pPr>
+            <w:r>
+              <w:rPr>
+                <w:b/>
+                <w:bCs/>
+              </w:rPr>
+              <w:t xml:space="preserve">Method</w:t>
+            </w:r>
+          </w:p>
+        </w:tc>
+        <w:tc>
+          <w:tcPr>
+            <w:tcW w:type="dxa" w:w="2400"/>
+            <w:tcBorders>
+              <w:top w:val="single" w:color="808080" w:sz="4"/>
+              <w:left w:val="single" w:color="808080" w:sz="4"/>
+              <w:bottom w:val="single" w:color="808080" w:sz="4"/>
+              <w:right w:val="single" w:color="808080" w:sz="4"/>
+            </w:tcBorders>
+            <w:shd w:fill="D5E8F0" w:color="auto" w:val="clear"/>
+            <w:tcMar>
+              <w:top w:type="dxa" w:w="120"/>
+              <w:left w:type="dxa" w:w="160"/>
+              <w:bottom w:type="dxa" w:w="120"/>
+              <w:right w:type="dxa" w:w="160"/>
+            </w:tcMar>
+          </w:tcPr>
+          <w:p>
+            <w:pPr>
+              <w:spacing w:after="0" w:line="260"/>
+              <w:jc w:val="left"/>
+            </w:pPr>
+            <w:r>
+              <w:rPr>
+                <w:b/>
+                <w:bCs/>
+              </w:rPr>
+              <w:t xml:space="preserve">Residual from fit</w:t>
+            </w:r>
+          </w:p>
+        </w:tc>
+        <w:tc>
+          <w:tcPr>
+            <w:tcW w:type="dxa" w:w="3760"/>
+            <w:tcBorders>
+              <w:top w:val="single" w:color="808080" w:sz="4"/>
+              <w:left w:val="single" w:color="808080" w:sz="4"/>
+              <w:bottom w:val="single" w:color="808080" w:sz="4"/>
+              <w:right w:val="single" w:color="808080" w:sz="4"/>
+            </w:tcBorders>
+            <w:shd w:fill="D5E8F0" w:color="auto" w:val="clear"/>
+            <w:tcMar>
+              <w:top w:type="dxa" w:w="120"/>
+              <w:left w:type="dxa" w:w="160"/>
+              <w:bottom w:type="dxa" w:w="120"/>
+              <w:right w:type="dxa" w:w="160"/>
+            </w:tcMar>
+          </w:tcPr>
+          <w:p>
+            <w:pPr>
+              <w:spacing w:after="0" w:line="260"/>
+              <w:jc w:val="left"/>
+            </w:pPr>
+            <w:r>
+              <w:rPr>
+                <w:b/>
+                <w:bCs/>
+              </w:rPr>
+              <w:t xml:space="preserve">Reading</w:t>
+            </w:r>
+          </w:p>
+        </w:tc>
+      </w:tr>
+      <w:tr>
+        <w:tc>
+          <w:tcPr>
+            <w:tcW w:type="dxa" w:w="3200"/>
+            <w:tcBorders>
+              <w:top w:val="single" w:color="808080" w:sz="4"/>
+              <w:left w:val="single" w:color="808080" w:sz="4"/>
+              <w:bottom w:val="single" w:color="808080" w:sz="4"/>
+              <w:right w:val="single" w:color="808080" w:sz="4"/>
+            </w:tcBorders>
+            <w:tcMar>
+              <w:top w:type="dxa" w:w="120"/>
+              <w:left w:type="dxa" w:w="160"/>
+              <w:bottom w:type="dxa" w:w="120"/>
+              <w:right w:type="dxa" w:w="160"/>
+            </w:tcMar>
+          </w:tcPr>
+          <w:p>
+            <w:pPr>
+              <w:spacing w:after="0" w:line="260"/>
+              <w:jc w:val="left"/>
+            </w:pPr>
+            <w:r>
+              <w:t xml:space="preserve">Full retrain</w:t>
+            </w:r>
+          </w:p>
+        </w:tc>
+        <w:tc>
+          <w:tcPr>
+            <w:tcW w:type="dxa" w:w="2400"/>
+            <w:tcBorders>
+              <w:top w:val="single" w:color="808080" w:sz="4"/>
+              <w:left w:val="single" w:color="808080" w:sz="4"/>
+              <w:bottom w:val="single" w:color="808080" w:sz="4"/>
+              <w:right w:val="single" w:color="808080" w:sz="4"/>
+            </w:tcBorders>
+            <w:tcMar>
+              <w:top w:type="dxa" w:w="120"/>
+              <w:left w:type="dxa" w:w="160"/>
+              <w:bottom w:type="dxa" w:w="120"/>
+              <w:right w:type="dxa" w:w="160"/>
+            </w:tcMar>
+          </w:tcPr>
+          <w:p>
+            <w:pPr>
+              <w:spacing w:after="0" w:line="260"/>
+              <w:jc w:val="left"/>
+            </w:pPr>
+            <w:r>
+              <w:t xml:space="preserve">-0.224</w:t>
+            </w:r>
+          </w:p>
+        </w:tc>
+        <w:tc>
+          <w:tcPr>
+            <w:tcW w:type="dxa" w:w="3760"/>
+            <w:tcBorders>
+              <w:top w:val="single" w:color="808080" w:sz="4"/>
+              <w:left w:val="single" w:color="808080" w:sz="4"/>
+              <w:bottom w:val="single" w:color="808080" w:sz="4"/>
+              <w:right w:val="single" w:color="808080" w:sz="4"/>
+            </w:tcBorders>
+            <w:tcMar>
+              <w:top w:type="dxa" w:w="120"/>
+              <w:left w:type="dxa" w:w="160"/>
+              <w:bottom w:type="dxa" w:w="120"/>
+              <w:right w:type="dxa" w:w="160"/>
+            </w:tcMar>
+          </w:tcPr>
+          <w:p>
+            <w:pPr>
+              <w:spacing w:after="0" w:line="260"/>
+              <w:jc w:val="left"/>
+            </w:pPr>
+            <w:r>
+              <w:t xml:space="preserve">Most durable for its damage</w:t>
+            </w:r>
+          </w:p>
+        </w:tc>
+      </w:tr>
+      <w:tr>
+        <w:tc>
+          <w:tcPr>
+            <w:tcW w:type="dxa" w:w="3200"/>
+            <w:tcBorders>
+              <w:top w:val="single" w:color="808080" w:sz="4"/>
+              <w:left w:val="single" w:color="808080" w:sz="4"/>
+              <w:bottom w:val="single" w:color="808080" w:sz="4"/>
+              <w:right w:val="single" w:color="808080" w:sz="4"/>
+            </w:tcBorders>
+            <w:tcMar>
+              <w:top w:type="dxa" w:w="120"/>
+              <w:left w:type="dxa" w:w="160"/>
+              <w:bottom w:type="dxa" w:w="120"/>
+              <w:right w:type="dxa" w:w="160"/>
+            </w:tcMar>
+          </w:tcPr>
+          <w:p>
+            <w:pPr>
+              <w:spacing w:after="0" w:line="260"/>
+              <w:jc w:val="left"/>
+            </w:pPr>
+            <w:r>
+              <w:t xml:space="preserve">HRU (unsharded)</w:t>
+            </w:r>
+          </w:p>
+        </w:tc>
+        <w:tc>
+          <w:tcPr>
+            <w:tcW w:type="dxa" w:w="2400"/>
+            <w:tcBorders>
+              <w:top w:val="single" w:color="808080" w:sz="4"/>
+              <w:left w:val="single" w:color="808080" w:sz="4"/>
+              <w:bottom w:val="single" w:color="808080" w:sz="4"/>
+              <w:right w:val="single" w:color="808080" w:sz="4"/>
+            </w:tcBorders>
+            <w:tcMar>
+              <w:top w:type="dxa" w:w="120"/>
+              <w:left w:type="dxa" w:w="160"/>
+              <w:bottom w:type="dxa" w:w="120"/>
+              <w:right w:type="dxa" w:w="160"/>
+            </w:tcMar>
+          </w:tcPr>
+          <w:p>
+            <w:pPr>
+              <w:spacing w:after="0" w:line="260"/>
+              <w:jc w:val="left"/>
+            </w:pPr>
+            <w:r>
+              <w:t xml:space="preserve">-0.203</w:t>
+            </w:r>
+          </w:p>
+        </w:tc>
+        <w:tc>
+          <w:tcPr>
+            <w:tcW w:type="dxa" w:w="3760"/>
+            <w:tcBorders>
+              <w:top w:val="single" w:color="808080" w:sz="4"/>
+              <w:left w:val="single" w:color="808080" w:sz="4"/>
+              <w:bottom w:val="single" w:color="808080" w:sz="4"/>
+              <w:right w:val="single" w:color="808080" w:sz="4"/>
+            </w:tcBorders>
+            <w:tcMar>
+              <w:top w:type="dxa" w:w="120"/>
+              <w:left w:type="dxa" w:w="160"/>
+              <w:bottom w:type="dxa" w:w="120"/>
+              <w:right w:type="dxa" w:w="160"/>
+            </w:tcMar>
+          </w:tcPr>
+          <w:p>
+            <w:pPr>
+              <w:spacing w:after="0" w:line="260"/>
+              <w:jc w:val="left"/>
+            </w:pPr>
+            <w:r>
+              <w:t xml:space="preserve">Second most durable for its damage</w:t>
+            </w:r>
+          </w:p>
+        </w:tc>
+      </w:tr>
+      <w:tr>
+        <w:tc>
+          <w:tcPr>
+            <w:tcW w:type="dxa" w:w="3200"/>
+            <w:tcBorders>
+              <w:top w:val="single" w:color="808080" w:sz="4"/>
+              <w:left w:val="single" w:color="808080" w:sz="4"/>
+              <w:bottom w:val="single" w:color="808080" w:sz="4"/>
+              <w:right w:val="single" w:color="808080" w:sz="4"/>
+            </w:tcBorders>
+            <w:tcMar>
+              <w:top w:type="dxa" w:w="120"/>
+              <w:left w:type="dxa" w:w="160"/>
+              <w:bottom w:type="dxa" w:w="120"/>
+              <w:right w:type="dxa" w:w="160"/>
+            </w:tcMar>
+          </w:tcPr>
+          <w:p>
+            <w:pPr>
+              <w:spacing w:after="0" w:line="260"/>
+              <w:jc w:val="left"/>
+            </w:pPr>
+            <w:r>
+              <w:t xml:space="preserve">Gradient ascent</w:t>
+            </w:r>
+          </w:p>
+        </w:tc>
+        <w:tc>
+          <w:tcPr>
+            <w:tcW w:type="dxa" w:w="2400"/>
+            <w:tcBorders>
+              <w:top w:val="single" w:color="808080" w:sz="4"/>
+              <w:left w:val="single" w:color="808080" w:sz="4"/>
+              <w:bottom w:val="single" w:color="808080" w:sz="4"/>
+              <w:right w:val="single" w:color="808080" w:sz="4"/>
+            </w:tcBorders>
+            <w:tcMar>
+              <w:top w:type="dxa" w:w="120"/>
+              <w:left w:type="dxa" w:w="160"/>
+              <w:bottom w:type="dxa" w:w="120"/>
+              <w:right w:type="dxa" w:w="160"/>
+            </w:tcMar>
+          </w:tcPr>
+          <w:p>
+            <w:pPr>
+              <w:spacing w:after="0" w:line="260"/>
+              <w:jc w:val="left"/>
+            </w:pPr>
+            <w:r>
+              <w:t xml:space="preserve">-0.122</w:t>
+            </w:r>
+          </w:p>
+        </w:tc>
+        <w:tc>
+          <w:tcPr>
+            <w:tcW w:type="dxa" w:w="3760"/>
+            <w:tcBorders>
+              <w:top w:val="single" w:color="808080" w:sz="4"/>
+              <w:left w:val="single" w:color="808080" w:sz="4"/>
+              <w:bottom w:val="single" w:color="808080" w:sz="4"/>
+              <w:right w:val="single" w:color="808080" w:sz="4"/>
+            </w:tcBorders>
+            <w:tcMar>
+              <w:top w:type="dxa" w:w="120"/>
+              <w:left w:type="dxa" w:w="160"/>
+              <w:bottom w:type="dxa" w:w="120"/>
+              <w:right w:type="dxa" w:w="160"/>
+            </w:tcMar>
+          </w:tcPr>
+          <w:p>
+            <w:pPr>
+              <w:spacing w:after="0" w:line="260"/>
+              <w:jc w:val="left"/>
+            </w:pPr>
+            <w:r>
+              <w:t xml:space="preserve">Above the trend</w:t>
+            </w:r>
+          </w:p>
+        </w:tc>
+      </w:tr>
+      <w:tr>
+        <w:tc>
+          <w:tcPr>
+            <w:tcW w:type="dxa" w:w="3200"/>
+            <w:tcBorders>
+              <w:top w:val="single" w:color="808080" w:sz="4"/>
+              <w:left w:val="single" w:color="808080" w:sz="4"/>
+              <w:bottom w:val="single" w:color="808080" w:sz="4"/>
+              <w:right w:val="single" w:color="808080" w:sz="4"/>
+            </w:tcBorders>
+            <w:tcMar>
+              <w:top w:type="dxa" w:w="120"/>
+              <w:left w:type="dxa" w:w="160"/>
+              <w:bottom w:type="dxa" w:w="120"/>
+              <w:right w:type="dxa" w:w="160"/>
+            </w:tcMar>
+          </w:tcPr>
+          <w:p>
+            <w:pPr>
+              <w:spacing w:after="0" w:line="260"/>
+              <w:jc w:val="left"/>
+            </w:pPr>
+            <w:r>
+              <w:t xml:space="preserve">HRU, k = 8</w:t>
+            </w:r>
+          </w:p>
+        </w:tc>
+        <w:tc>
+          <w:tcPr>
+            <w:tcW w:type="dxa" w:w="2400"/>
+            <w:tcBorders>
+              <w:top w:val="single" w:color="808080" w:sz="4"/>
+              <w:left w:val="single" w:color="808080" w:sz="4"/>
+              <w:bottom w:val="single" w:color="808080" w:sz="4"/>
+              <w:right w:val="single" w:color="808080" w:sz="4"/>
+            </w:tcBorders>
+            <w:tcMar>
+              <w:top w:type="dxa" w:w="120"/>
+              <w:left w:type="dxa" w:w="160"/>
+              <w:bottom w:type="dxa" w:w="120"/>
+              <w:right w:type="dxa" w:w="160"/>
+            </w:tcMar>
+          </w:tcPr>
+          <w:p>
+            <w:pPr>
+              <w:spacing w:after="0" w:line="260"/>
+              <w:jc w:val="left"/>
+            </w:pPr>
+            <w:r>
+              <w:t xml:space="preserve">-0.077</w:t>
+            </w:r>
+          </w:p>
+        </w:tc>
+        <w:tc>
+          <w:tcPr>
+            <w:tcW w:type="dxa" w:w="3760"/>
+            <w:tcBorders>
+              <w:top w:val="single" w:color="808080" w:sz="4"/>
+              <w:left w:val="single" w:color="808080" w:sz="4"/>
+              <w:bottom w:val="single" w:color="808080" w:sz="4"/>
+              <w:right w:val="single" w:color="808080" w:sz="4"/>
+            </w:tcBorders>
+            <w:tcMar>
+              <w:top w:type="dxa" w:w="120"/>
+              <w:left w:type="dxa" w:w="160"/>
+              <w:bottom w:type="dxa" w:w="120"/>
+              <w:right w:type="dxa" w:w="160"/>
+            </w:tcMar>
+          </w:tcPr>
+          <w:p>
+            <w:pPr>
+              <w:spacing w:after="0" w:line="260"/>
+              <w:jc w:val="left"/>
+            </w:pPr>
+            <w:r>
+              <w:t xml:space="preserve">Slightly above the trend</w:t>
+            </w:r>
+          </w:p>
+        </w:tc>
+      </w:tr>
+      <w:tr>
+        <w:tc>
+          <w:tcPr>
+            <w:tcW w:type="dxa" w:w="3200"/>
+            <w:tcBorders>
+              <w:top w:val="single" w:color="808080" w:sz="4"/>
+              <w:left w:val="single" w:color="808080" w:sz="4"/>
+              <w:bottom w:val="single" w:color="808080" w:sz="4"/>
+              <w:right w:val="single" w:color="808080" w:sz="4"/>
+            </w:tcBorders>
+            <w:tcMar>
+              <w:top w:type="dxa" w:w="120"/>
+              <w:left w:type="dxa" w:w="160"/>
+              <w:bottom w:type="dxa" w:w="120"/>
+              <w:right w:type="dxa" w:w="160"/>
+            </w:tcMar>
+          </w:tcPr>
+          <w:p>
+            <w:pPr>
+              <w:spacing w:after="0" w:line="260"/>
+              <w:jc w:val="left"/>
+            </w:pPr>
+            <w:r>
+              <w:t xml:space="preserve">RMU</w:t>
+            </w:r>
+          </w:p>
+        </w:tc>
+        <w:tc>
+          <w:tcPr>
+            <w:tcW w:type="dxa" w:w="2400"/>
+            <w:tcBorders>
+              <w:top w:val="single" w:color="808080" w:sz="4"/>
+              <w:left w:val="single" w:color="808080" w:sz="4"/>
+              <w:bottom w:val="single" w:color="808080" w:sz="4"/>
+              <w:right w:val="single" w:color="808080" w:sz="4"/>
+            </w:tcBorders>
+            <w:tcMar>
+              <w:top w:type="dxa" w:w="120"/>
+              <w:left w:type="dxa" w:w="160"/>
+              <w:bottom w:type="dxa" w:w="120"/>
+              <w:right w:type="dxa" w:w="160"/>
+            </w:tcMar>
+          </w:tcPr>
+          <w:p>
+            <w:pPr>
+              <w:spacing w:after="0" w:line="260"/>
+              <w:jc w:val="left"/>
+            </w:pPr>
+            <w:r>
+              <w:t xml:space="preserve">+0.084</w:t>
+            </w:r>
+          </w:p>
+        </w:tc>
+        <w:tc>
+          <w:tcPr>
+            <w:tcW w:type="dxa" w:w="3760"/>
+            <w:tcBorders>
+              <w:top w:val="single" w:color="808080" w:sz="4"/>
+              <w:left w:val="single" w:color="808080" w:sz="4"/>
+              <w:bottom w:val="single" w:color="808080" w:sz="4"/>
+              <w:right w:val="single" w:color="808080" w:sz="4"/>
+            </w:tcBorders>
+            <w:tcMar>
+              <w:top w:type="dxa" w:w="120"/>
+              <w:left w:type="dxa" w:w="160"/>
+              <w:bottom w:type="dxa" w:w="120"/>
+              <w:right w:type="dxa" w:w="160"/>
+            </w:tcMar>
+          </w:tcPr>
+          <w:p>
+            <w:pPr>
+              <w:spacing w:after="0" w:line="260"/>
+              <w:jc w:val="left"/>
+            </w:pPr>
+            <w:r>
+              <w:t xml:space="preserve">Below the trend</w:t>
+            </w:r>
+          </w:p>
+        </w:tc>
+      </w:tr>
+      <w:tr>
+        <w:tc>
+          <w:tcPr>
+            <w:tcW w:type="dxa" w:w="3200"/>
+            <w:tcBorders>
+              <w:top w:val="single" w:color="808080" w:sz="4"/>
+              <w:left w:val="single" w:color="808080" w:sz="4"/>
+              <w:bottom w:val="single" w:color="808080" w:sz="4"/>
+              <w:right w:val="single" w:color="808080" w:sz="4"/>
+            </w:tcBorders>
+            <w:tcMar>
+              <w:top w:type="dxa" w:w="120"/>
+              <w:left w:type="dxa" w:w="160"/>
+              <w:bottom w:type="dxa" w:w="120"/>
+              <w:right w:type="dxa" w:w="160"/>
+            </w:tcMar>
+          </w:tcPr>
+          <w:p>
+            <w:pPr>
+              <w:spacing w:after="0" w:line="260"/>
+              <w:jc w:val="left"/>
+            </w:pPr>
+            <w:r>
+              <w:t xml:space="preserve">NPO</w:t>
+            </w:r>
+          </w:p>
+        </w:tc>
+        <w:tc>
+          <w:tcPr>
+            <w:tcW w:type="dxa" w:w="2400"/>
+            <w:tcBorders>
+              <w:top w:val="single" w:color="808080" w:sz="4"/>
+              <w:left w:val="single" w:color="808080" w:sz="4"/>
+              <w:bottom w:val="single" w:color="808080" w:sz="4"/>
+              <w:right w:val="single" w:color="808080" w:sz="4"/>
+            </w:tcBorders>
+            <w:tcMar>
+              <w:top w:type="dxa" w:w="120"/>
+              <w:left w:type="dxa" w:w="160"/>
+              <w:bottom w:type="dxa" w:w="120"/>
+              <w:right w:type="dxa" w:w="160"/>
+            </w:tcMar>
+          </w:tcPr>
+          <w:p>
+            <w:pPr>
+              <w:spacing w:after="0" w:line="260"/>
+              <w:jc w:val="left"/>
+            </w:pPr>
+            <w:r>
+              <w:t xml:space="preserve">+0.293</w:t>
+            </w:r>
+          </w:p>
+        </w:tc>
+        <w:tc>
+          <w:tcPr>
+            <w:tcW w:type="dxa" w:w="3760"/>
+            <w:tcBorders>
+              <w:top w:val="single" w:color="808080" w:sz="4"/>
+              <w:left w:val="single" w:color="808080" w:sz="4"/>
+              <w:bottom w:val="single" w:color="808080" w:sz="4"/>
+              <w:right w:val="single" w:color="808080" w:sz="4"/>
+            </w:tcBorders>
+            <w:tcMar>
+              <w:top w:type="dxa" w:w="120"/>
+              <w:left w:type="dxa" w:w="160"/>
+              <w:bottom w:type="dxa" w:w="120"/>
+              <w:right w:type="dxa" w:w="160"/>
+            </w:tcMar>
+          </w:tcPr>
+          <w:p>
+            <w:pPr>
+              <w:spacing w:after="0" w:line="260"/>
+              <w:jc w:val="left"/>
+            </w:pPr>
+            <w:r>
+              <w:t xml:space="preserve">Least durable for its damage</w:t>
+            </w:r>
+          </w:p>
+        </w:tc>
+      </w:tr>
+    </w:tbl>
+    <w:p>
+      <w:pPr>
+        <w:spacing w:after="240" w:before="80"/>
+        <w:jc w:val="center"/>
+      </w:pPr>
+      <w:r>
+        <w:rPr>
+          <w:i/>
+          <w:iCs/>
+          <w:sz w:val="22"/>
+          <w:szCs w:val="22"/>
+        </w:rPr>
+        <w:t xml:space="preserve">Table 4.3: Durability Adjusted for Model Damage</w:t>
+      </w:r>
+    </w:p>
+    <w:p>
+      <w:pPr>
+        <w:spacing w:after="120" w:before="0" w:line="360"/>
+        <w:jc w:val="both"/>
+      </w:pPr>
+      <w:r>
+        <w:t xml:space="preserve">After adjustment, HRU remains second only to full retraining, while NPO is the weakest. HRU's lead therefore reflects more than damage, but the size of its true advantage can only be established with a fact-level metric, which has been implemented for the validation phase.</w:t>
+      </w:r>
+    </w:p>
+    <w:p>
+      <w:pPr>
+        <w:pStyle w:val="Heading2"/>
+        <w:keepNext/>
+      </w:pPr>
+      <w:r>
+        <w:t xml:space="preserve">4.5 Cost Analysis</w:t>
+      </w:r>
+    </w:p>
+    <w:tbl>
+      <w:tblPr>
+        <w:tblW w:type="dxa" w:w="9360"/>
+        <w:jc w:val="center"/>
+        <w:tblBorders>
+          <w:top w:val="single" w:color="auto" w:sz="4"/>
+          <w:left w:val="single" w:color="auto" w:sz="4"/>
+          <w:bottom w:val="single" w:color="auto" w:sz="4"/>
+          <w:right w:val="single" w:color="auto" w:sz="4"/>
+          <w:insideH w:val="single" w:color="auto" w:sz="4"/>
+          <w:insideV w:val="single" w:color="auto" w:sz="4"/>
+        </w:tblBorders>
+        <w:tblLayout w:type="fixed"/>
+      </w:tblPr>
+      <w:tblGrid>
+        <w:gridCol w:w="3800"/>
+        <w:gridCol w:w="2700"/>
+        <w:gridCol w:w="2860"/>
+      </w:tblGrid>
+      <w:tr>
+        <w:trPr>
+          <w:tblHeader/>
+        </w:trPr>
+        <w:tc>
+          <w:tcPr>
+            <w:tcW w:type="dxa" w:w="3800"/>
+            <w:tcBorders>
+              <w:top w:val="single" w:color="808080" w:sz="4"/>
+              <w:left w:val="single" w:color="808080" w:sz="4"/>
+              <w:bottom w:val="single" w:color="808080" w:sz="4"/>
+              <w:right w:val="single" w:color="808080" w:sz="4"/>
+            </w:tcBorders>
+            <w:shd w:fill="D5E8F0" w:color="auto" w:val="clear"/>
+            <w:tcMar>
+              <w:top w:type="dxa" w:w="120"/>
+              <w:left w:type="dxa" w:w="160"/>
+              <w:bottom w:type="dxa" w:w="120"/>
+              <w:right w:type="dxa" w:w="160"/>
+            </w:tcMar>
+          </w:tcPr>
+          <w:p>
+            <w:pPr>
+              <w:spacing w:after="0" w:line="260"/>
+              <w:jc w:val="left"/>
+            </w:pPr>
+            <w:r>
+              <w:rPr>
+                <w:b/>
+                <w:bCs/>
+              </w:rPr>
+              <w:t xml:space="preserve">Method</w:t>
+            </w:r>
+          </w:p>
+        </w:tc>
+        <w:tc>
+          <w:tcPr>
+            <w:tcW w:type="dxa" w:w="2700"/>
+            <w:tcBorders>
+              <w:top w:val="single" w:color="808080" w:sz="4"/>
+              <w:left w:val="single" w:color="808080" w:sz="4"/>
+              <w:bottom w:val="single" w:color="808080" w:sz="4"/>
+              <w:right w:val="single" w:color="808080" w:sz="4"/>
+            </w:tcBorders>
+            <w:shd w:fill="D5E8F0" w:color="auto" w:val="clear"/>
+            <w:tcMar>
+              <w:top w:type="dxa" w:w="120"/>
+              <w:left w:type="dxa" w:w="160"/>
+              <w:bottom w:type="dxa" w:w="120"/>
+              <w:right w:type="dxa" w:w="160"/>
+            </w:tcMar>
+          </w:tcPr>
+          <w:p>
+            <w:pPr>
+              <w:spacing w:after="0" w:line="260"/>
+              <w:jc w:val="left"/>
+            </w:pPr>
+            <w:r>
+              <w:rPr>
+                <w:b/>
+                <w:bCs/>
+              </w:rPr>
+              <w:t xml:space="preserve">Updates per request</w:t>
+            </w:r>
+          </w:p>
+        </w:tc>
+        <w:tc>
+          <w:tcPr>
+            <w:tcW w:type="dxa" w:w="2860"/>
+            <w:tcBorders>
+              <w:top w:val="single" w:color="808080" w:sz="4"/>
+              <w:left w:val="single" w:color="808080" w:sz="4"/>
+              <w:bottom w:val="single" w:color="808080" w:sz="4"/>
+              <w:right w:val="single" w:color="808080" w:sz="4"/>
+            </w:tcBorders>
+            <w:shd w:fill="D5E8F0" w:color="auto" w:val="clear"/>
+            <w:tcMar>
+              <w:top w:type="dxa" w:w="120"/>
+              <w:left w:type="dxa" w:w="160"/>
+              <w:bottom w:type="dxa" w:w="120"/>
+              <w:right w:type="dxa" w:w="160"/>
+            </w:tcMar>
+          </w:tcPr>
+          <w:p>
+            <w:pPr>
+              <w:spacing w:after="0" w:line="260"/>
+              <w:jc w:val="left"/>
+            </w:pPr>
+            <w:r>
+              <w:rPr>
+                <w:b/>
+                <w:bCs/>
+              </w:rPr>
+              <w:t xml:space="preserve">Relative to one NPO pass</w:t>
+            </w:r>
+          </w:p>
+        </w:tc>
+      </w:tr>
+      <w:tr>
+        <w:tc>
+          <w:tcPr>
+            <w:tcW w:type="dxa" w:w="3800"/>
+            <w:tcBorders>
+              <w:top w:val="single" w:color="808080" w:sz="4"/>
+              <w:left w:val="single" w:color="808080" w:sz="4"/>
+              <w:bottom w:val="single" w:color="808080" w:sz="4"/>
+              <w:right w:val="single" w:color="808080" w:sz="4"/>
+            </w:tcBorders>
+            <w:tcMar>
+              <w:top w:type="dxa" w:w="120"/>
+              <w:left w:type="dxa" w:w="160"/>
+              <w:bottom w:type="dxa" w:w="120"/>
+              <w:right w:type="dxa" w:w="160"/>
+            </w:tcMar>
+          </w:tcPr>
+          <w:p>
+            <w:pPr>
+              <w:spacing w:after="0" w:line="260"/>
+              <w:jc w:val="left"/>
+            </w:pPr>
+            <w:r>
+              <w:t xml:space="preserve">SISA (shard 0 only)</w:t>
+            </w:r>
+          </w:p>
+        </w:tc>
+        <w:tc>
+          <w:tcPr>
+            <w:tcW w:type="dxa" w:w="2700"/>
+            <w:tcBorders>
+              <w:top w:val="single" w:color="808080" w:sz="4"/>
+              <w:left w:val="single" w:color="808080" w:sz="4"/>
+              <w:bottom w:val="single" w:color="808080" w:sz="4"/>
+              <w:right w:val="single" w:color="808080" w:sz="4"/>
+            </w:tcBorders>
+            <w:tcMar>
+              <w:top w:type="dxa" w:w="120"/>
+              <w:left w:type="dxa" w:w="160"/>
+              <w:bottom w:type="dxa" w:w="120"/>
+              <w:right w:type="dxa" w:w="160"/>
+            </w:tcMar>
+          </w:tcPr>
+          <w:p>
+            <w:pPr>
+              <w:spacing w:after="0" w:line="260"/>
+              <w:jc w:val="left"/>
+            </w:pPr>
+            <w:r>
+              <w:t xml:space="preserve">26</w:t>
+            </w:r>
+          </w:p>
+        </w:tc>
+        <w:tc>
+          <w:tcPr>
+            <w:tcW w:type="dxa" w:w="2860"/>
+            <w:tcBorders>
+              <w:top w:val="single" w:color="808080" w:sz="4"/>
+              <w:left w:val="single" w:color="808080" w:sz="4"/>
+              <w:bottom w:val="single" w:color="808080" w:sz="4"/>
+              <w:right w:val="single" w:color="808080" w:sz="4"/>
+            </w:tcBorders>
+            <w:tcMar>
+              <w:top w:type="dxa" w:w="120"/>
+              <w:left w:type="dxa" w:w="160"/>
+              <w:bottom w:type="dxa" w:w="120"/>
+              <w:right w:type="dxa" w:w="160"/>
+            </w:tcMar>
+          </w:tcPr>
+          <w:p>
+            <w:pPr>
+              <w:spacing w:after="0" w:line="260"/>
+              <w:jc w:val="left"/>
+            </w:pPr>
+            <w:r>
+              <w:t xml:space="preserve">0.65×</w:t>
+            </w:r>
+          </w:p>
+        </w:tc>
+      </w:tr>
+      <w:tr>
+        <w:tc>
+          <w:tcPr>
+            <w:tcW w:type="dxa" w:w="3800"/>
+            <w:tcBorders>
+              <w:top w:val="single" w:color="808080" w:sz="4"/>
+              <w:left w:val="single" w:color="808080" w:sz="4"/>
+              <w:bottom w:val="single" w:color="808080" w:sz="4"/>
+              <w:right w:val="single" w:color="808080" w:sz="4"/>
+            </w:tcBorders>
+            <w:tcMar>
+              <w:top w:type="dxa" w:w="120"/>
+              <w:left w:type="dxa" w:w="160"/>
+              <w:bottom w:type="dxa" w:w="120"/>
+              <w:right w:type="dxa" w:w="160"/>
+            </w:tcMar>
+          </w:tcPr>
+          <w:p>
+            <w:pPr>
+              <w:spacing w:after="0" w:line="260"/>
+              <w:jc w:val="left"/>
+            </w:pPr>
+            <w:r>
+              <w:t xml:space="preserve">Gradient ascent, NPO, RMU</w:t>
+            </w:r>
+          </w:p>
+        </w:tc>
+        <w:tc>
+          <w:tcPr>
+            <w:tcW w:type="dxa" w:w="2700"/>
+            <w:tcBorders>
+              <w:top w:val="single" w:color="808080" w:sz="4"/>
+              <w:left w:val="single" w:color="808080" w:sz="4"/>
+              <w:bottom w:val="single" w:color="808080" w:sz="4"/>
+              <w:right w:val="single" w:color="808080" w:sz="4"/>
+            </w:tcBorders>
+            <w:tcMar>
+              <w:top w:type="dxa" w:w="120"/>
+              <w:left w:type="dxa" w:w="160"/>
+              <w:bottom w:type="dxa" w:w="120"/>
+              <w:right w:type="dxa" w:w="160"/>
+            </w:tcMar>
+          </w:tcPr>
+          <w:p>
+            <w:pPr>
+              <w:spacing w:after="0" w:line="260"/>
+              <w:jc w:val="left"/>
+            </w:pPr>
+            <w:r>
+              <w:t xml:space="preserve">40</w:t>
+            </w:r>
+          </w:p>
+        </w:tc>
+        <w:tc>
+          <w:tcPr>
+            <w:tcW w:type="dxa" w:w="2860"/>
+            <w:tcBorders>
+              <w:top w:val="single" w:color="808080" w:sz="4"/>
+              <w:left w:val="single" w:color="808080" w:sz="4"/>
+              <w:bottom w:val="single" w:color="808080" w:sz="4"/>
+              <w:right w:val="single" w:color="808080" w:sz="4"/>
+            </w:tcBorders>
+            <w:tcMar>
+              <w:top w:type="dxa" w:w="120"/>
+              <w:left w:type="dxa" w:w="160"/>
+              <w:bottom w:type="dxa" w:w="120"/>
+              <w:right w:type="dxa" w:w="160"/>
+            </w:tcMar>
+          </w:tcPr>
+          <w:p>
+            <w:pPr>
+              <w:spacing w:after="0" w:line="260"/>
+              <w:jc w:val="left"/>
+            </w:pPr>
+            <w:r>
+              <w:t xml:space="preserve">1.0×</w:t>
+            </w:r>
+          </w:p>
+        </w:tc>
+      </w:tr>
+      <w:tr>
+        <w:tc>
+          <w:tcPr>
+            <w:tcW w:type="dxa" w:w="3800"/>
+            <w:tcBorders>
+              <w:top w:val="single" w:color="808080" w:sz="4"/>
+              <w:left w:val="single" w:color="808080" w:sz="4"/>
+              <w:bottom w:val="single" w:color="808080" w:sz="4"/>
+              <w:right w:val="single" w:color="808080" w:sz="4"/>
+            </w:tcBorders>
+            <w:tcMar>
+              <w:top w:type="dxa" w:w="120"/>
+              <w:left w:type="dxa" w:w="160"/>
+              <w:bottom w:type="dxa" w:w="120"/>
+              <w:right w:type="dxa" w:w="160"/>
+            </w:tcMar>
+          </w:tcPr>
+          <w:p>
+            <w:pPr>
+              <w:spacing w:after="0" w:line="260"/>
+              <w:jc w:val="left"/>
+            </w:pPr>
+            <w:r>
+              <w:t xml:space="preserve">HRU (scrub updates)</w:t>
+            </w:r>
+          </w:p>
+        </w:tc>
+        <w:tc>
+          <w:tcPr>
+            <w:tcW w:type="dxa" w:w="2700"/>
+            <w:tcBorders>
+              <w:top w:val="single" w:color="808080" w:sz="4"/>
+              <w:left w:val="single" w:color="808080" w:sz="4"/>
+              <w:bottom w:val="single" w:color="808080" w:sz="4"/>
+              <w:right w:val="single" w:color="808080" w:sz="4"/>
+            </w:tcBorders>
+            <w:tcMar>
+              <w:top w:type="dxa" w:w="120"/>
+              <w:left w:type="dxa" w:w="160"/>
+              <w:bottom w:type="dxa" w:w="120"/>
+              <w:right w:type="dxa" w:w="160"/>
+            </w:tcMar>
+          </w:tcPr>
+          <w:p>
+            <w:pPr>
+              <w:spacing w:after="0" w:line="260"/>
+              <w:jc w:val="left"/>
+            </w:pPr>
+            <w:r>
+              <w:t xml:space="preserve">120</w:t>
+            </w:r>
+          </w:p>
+        </w:tc>
+        <w:tc>
+          <w:tcPr>
+            <w:tcW w:type="dxa" w:w="2860"/>
+            <w:tcBorders>
+              <w:top w:val="single" w:color="808080" w:sz="4"/>
+              <w:left w:val="single" w:color="808080" w:sz="4"/>
+              <w:bottom w:val="single" w:color="808080" w:sz="4"/>
+              <w:right w:val="single" w:color="808080" w:sz="4"/>
+            </w:tcBorders>
+            <w:tcMar>
+              <w:top w:type="dxa" w:w="120"/>
+              <w:left w:type="dxa" w:w="160"/>
+              <w:bottom w:type="dxa" w:w="120"/>
+              <w:right w:type="dxa" w:w="160"/>
+            </w:tcMar>
+          </w:tcPr>
+          <w:p>
+            <w:pPr>
+              <w:spacing w:after="0" w:line="260"/>
+              <w:jc w:val="left"/>
+            </w:pPr>
+            <w:r>
+              <w:t xml:space="preserve">3.0×</w:t>
+            </w:r>
+          </w:p>
+        </w:tc>
+      </w:tr>
+      <w:tr>
+        <w:tc>
+          <w:tcPr>
+            <w:tcW w:type="dxa" w:w="3800"/>
+            <w:tcBorders>
+              <w:top w:val="single" w:color="808080" w:sz="4"/>
+              <w:left w:val="single" w:color="808080" w:sz="4"/>
+              <w:bottom w:val="single" w:color="808080" w:sz="4"/>
+              <w:right w:val="single" w:color="808080" w:sz="4"/>
+            </w:tcBorders>
+            <w:tcMar>
+              <w:top w:type="dxa" w:w="120"/>
+              <w:left w:type="dxa" w:w="160"/>
+              <w:bottom w:type="dxa" w:w="120"/>
+              <w:right w:type="dxa" w:w="160"/>
+            </w:tcMar>
+          </w:tcPr>
+          <w:p>
+            <w:pPr>
+              <w:spacing w:after="0" w:line="260"/>
+              <w:jc w:val="left"/>
+            </w:pPr>
+            <w:r>
+              <w:t xml:space="preserve">Full retrain</w:t>
+            </w:r>
+          </w:p>
+        </w:tc>
+        <w:tc>
+          <w:tcPr>
+            <w:tcW w:type="dxa" w:w="2700"/>
+            <w:tcBorders>
+              <w:top w:val="single" w:color="808080" w:sz="4"/>
+              <w:left w:val="single" w:color="808080" w:sz="4"/>
+              <w:bottom w:val="single" w:color="808080" w:sz="4"/>
+              <w:right w:val="single" w:color="808080" w:sz="4"/>
+            </w:tcBorders>
+            <w:tcMar>
+              <w:top w:type="dxa" w:w="120"/>
+              <w:left w:type="dxa" w:w="160"/>
+              <w:bottom w:type="dxa" w:w="120"/>
+              <w:right w:type="dxa" w:w="160"/>
+            </w:tcMar>
+          </w:tcPr>
+          <w:p>
+            <w:pPr>
+              <w:spacing w:after="0" w:line="260"/>
+              <w:jc w:val="left"/>
+            </w:pPr>
+            <w:r>
+              <w:t xml:space="preserve">150</w:t>
+            </w:r>
+          </w:p>
+        </w:tc>
+        <w:tc>
+          <w:tcPr>
+            <w:tcW w:type="dxa" w:w="2860"/>
+            <w:tcBorders>
+              <w:top w:val="single" w:color="808080" w:sz="4"/>
+              <w:left w:val="single" w:color="808080" w:sz="4"/>
+              <w:bottom w:val="single" w:color="808080" w:sz="4"/>
+              <w:right w:val="single" w:color="808080" w:sz="4"/>
+            </w:tcBorders>
+            <w:tcMar>
+              <w:top w:type="dxa" w:w="120"/>
+              <w:left w:type="dxa" w:w="160"/>
+              <w:bottom w:type="dxa" w:w="120"/>
+              <w:right w:type="dxa" w:w="160"/>
+            </w:tcMar>
+          </w:tcPr>
+          <w:p>
+            <w:pPr>
+              <w:spacing w:after="0" w:line="260"/>
+              <w:jc w:val="left"/>
+            </w:pPr>
+            <w:r>
+              <w:t xml:space="preserve">3.75×</w:t>
+            </w:r>
+          </w:p>
+        </w:tc>
+      </w:tr>
+    </w:tbl>
+    <w:p>
+      <w:pPr>
+        <w:spacing w:after="240" w:before="80"/>
+        <w:jc w:val="center"/>
+      </w:pPr>
+      <w:r>
+        <w:rPr>
+          <w:i/>
+          <w:iCs/>
+          <w:sz w:val="22"/>
+          <w:szCs w:val="22"/>
+        </w:rPr>
+        <w:t xml:space="preserve">Table 4.4: Cost per Deletion Request</w:t>
+      </w:r>
+    </w:p>
+    <w:p>
+      <w:pPr>
+        <w:spacing w:after="120" w:before="0" w:line="360"/>
+        <w:jc w:val="both"/>
+      </w:pPr>
+      <w:r>
+        <w:t xml:space="preserve">HRU used 120 optimizer updates per request, 3.0 times one NPO pass and within the 2-5× design target. Each SAM update requires two forward-backward passes, and the attack probes add further passes on model copies, so wall-clock cost is higher than the update count suggests. At this scale full retraining is unusually cheap because the corpus has only 400 retain examples; in deployment its cost grows with the whole training corpus, while HRU's grows only with the data being forgotten. SISA's one-time cost of training its shards is excluded, as it is amortised over all future requests.</w:t>
+      </w:r>
+    </w:p>
+    <w:p>
+      <w:pPr>
+        <w:spacing w:after="120" w:before="0" w:line="360"/>
+        <w:jc w:val="both"/>
+      </w:pPr>
+      <w:r>
+        <w:t xml:space="preserve">Section 4.3 and Figure 4.3 place these costs against durability: unsharded HRU is the most durable method inside the target zone, at 80% of the cost of full retraining.</w:t>
       </w:r>
     </w:p>
     <w:p>
@@ -10380,7 +11525,7 @@
         <w:jc w:val="both"/>
       </w:pPr>
       <w:r>
-        <w:t xml:space="preserve">Screenshots of work done and of deployment tools.</w:t>
+        <w:t xml:space="preserve">Screenshots of work done and of the team GitHub repository.</w:t>
       </w:r>
     </w:p>
     <w:p>
@@ -10410,7 +11555,7 @@
         <w:keepNext/>
       </w:pPr>
       <w:r>
-        <w:t xml:space="preserve">I.2 Deployment Tools</w:t>
+        <w:t xml:space="preserve">I.2 GitHub Repository</w:t>
       </w:r>
     </w:p>
     <w:p>

</xml_diff>